<commit_message>
Showing github and godot information
Deledted D1.tres

instantiated newspaper into home scene.

updated Task.Doc
</commit_message>
<xml_diff>
--- a/Week 4/Tasks.docx
+++ b/Week 4/Tasks.docx
@@ -29,6 +29,7 @@
           <w:szCs w:val="52"/>
         </w:rPr>
       </w:pPr>
+      <w:proofErr w:type="spellStart"/>
       <w:r>
         <w:rPr>
           <w:sz w:val="52"/>
@@ -36,6 +37,14 @@
         </w:rPr>
         <w:t>Game_Manager</w:t>
       </w:r>
+      <w:proofErr w:type="spellEnd"/>
+      <w:r>
+        <w:rPr>
+          <w:sz w:val="52"/>
+          <w:szCs w:val="52"/>
+        </w:rPr>
+        <w:t xml:space="preserve"> </w:t>
+      </w:r>
     </w:p>
     <w:p>
       <w:pPr>
@@ -83,8 +92,54 @@
           <w:sz w:val="52"/>
           <w:szCs w:val="52"/>
         </w:rPr>
-        <w:t>Create func to pause game when pause_game signal and display Pause_UI</w:t>
-      </w:r>
+        <w:t xml:space="preserve">Create </w:t>
+      </w:r>
+      <w:proofErr w:type="spellStart"/>
+      <w:r>
+        <w:rPr>
+          <w:color w:val="4EA72E" w:themeColor="accent6"/>
+          <w:sz w:val="52"/>
+          <w:szCs w:val="52"/>
+        </w:rPr>
+        <w:t>func</w:t>
+      </w:r>
+      <w:proofErr w:type="spellEnd"/>
+      <w:r>
+        <w:rPr>
+          <w:color w:val="4EA72E" w:themeColor="accent6"/>
+          <w:sz w:val="52"/>
+          <w:szCs w:val="52"/>
+        </w:rPr>
+        <w:t xml:space="preserve"> to pause game when </w:t>
+      </w:r>
+      <w:proofErr w:type="spellStart"/>
+      <w:r>
+        <w:rPr>
+          <w:color w:val="4EA72E" w:themeColor="accent6"/>
+          <w:sz w:val="52"/>
+          <w:szCs w:val="52"/>
+        </w:rPr>
+        <w:t>pause_game</w:t>
+      </w:r>
+      <w:proofErr w:type="spellEnd"/>
+      <w:r>
+        <w:rPr>
+          <w:color w:val="4EA72E" w:themeColor="accent6"/>
+          <w:sz w:val="52"/>
+          <w:szCs w:val="52"/>
+        </w:rPr>
+        <w:t xml:space="preserve"> signal and display </w:t>
+      </w:r>
+      <w:proofErr w:type="spellStart"/>
+      <w:r>
+        <w:rPr>
+          <w:color w:val="4EA72E" w:themeColor="accent6"/>
+          <w:sz w:val="52"/>
+          <w:szCs w:val="52"/>
+        </w:rPr>
+        <w:t>Pause_UI</w:t>
+      </w:r>
+      <w:proofErr w:type="spellEnd"/>
     </w:p>
     <w:p>
       <w:pPr>
@@ -105,15 +160,33 @@
           <w:sz w:val="52"/>
           <w:szCs w:val="52"/>
         </w:rPr>
-        <w:t>Create fun</w:t>
-      </w:r>
-      <w:r>
-        <w:rPr>
-          <w:color w:val="E97132" w:themeColor="accent2"/>
-          <w:sz w:val="52"/>
-          <w:szCs w:val="52"/>
-        </w:rPr>
-        <w:t xml:space="preserve">c </w:t>
+        <w:t xml:space="preserve">Create </w:t>
+      </w:r>
+      <w:proofErr w:type="spellStart"/>
+      <w:r>
+        <w:rPr>
+          <w:color w:val="E97132" w:themeColor="accent2"/>
+          <w:sz w:val="52"/>
+          <w:szCs w:val="52"/>
+        </w:rPr>
+        <w:t>fun</w:t>
+      </w:r>
+      <w:r>
+        <w:rPr>
+          <w:color w:val="E97132" w:themeColor="accent2"/>
+          <w:sz w:val="52"/>
+          <w:szCs w:val="52"/>
+        </w:rPr>
+        <w:t>c</w:t>
+      </w:r>
+      <w:proofErr w:type="spellEnd"/>
+      <w:r>
+        <w:rPr>
+          <w:color w:val="E97132" w:themeColor="accent2"/>
+          <w:sz w:val="52"/>
+          <w:szCs w:val="52"/>
+        </w:rPr>
+        <w:t xml:space="preserve"> </w:t>
       </w:r>
       <w:r>
         <w:rPr>
@@ -131,13 +204,23 @@
         </w:rPr>
         <w:t xml:space="preserve"> </w:t>
       </w:r>
-      <w:r>
-        <w:rPr>
-          <w:color w:val="E97132" w:themeColor="accent2"/>
-          <w:sz w:val="52"/>
-          <w:szCs w:val="52"/>
-        </w:rPr>
-        <w:t>save_game signal is emitted.</w:t>
+      <w:proofErr w:type="spellStart"/>
+      <w:r>
+        <w:rPr>
+          <w:color w:val="E97132" w:themeColor="accent2"/>
+          <w:sz w:val="52"/>
+          <w:szCs w:val="52"/>
+        </w:rPr>
+        <w:t>save_game</w:t>
+      </w:r>
+      <w:proofErr w:type="spellEnd"/>
+      <w:r>
+        <w:rPr>
+          <w:color w:val="E97132" w:themeColor="accent2"/>
+          <w:sz w:val="52"/>
+          <w:szCs w:val="52"/>
+        </w:rPr>
+        <w:t xml:space="preserve"> signal is emitted.</w:t>
       </w:r>
     </w:p>
     <w:p>
@@ -157,7 +240,39 @@
           <w:sz w:val="52"/>
           <w:szCs w:val="52"/>
         </w:rPr>
-        <w:t>Create func to quit game when quit_game signal is emitted.</w:t>
+        <w:t xml:space="preserve">Create </w:t>
+      </w:r>
+      <w:proofErr w:type="spellStart"/>
+      <w:r>
+        <w:rPr>
+          <w:sz w:val="52"/>
+          <w:szCs w:val="52"/>
+        </w:rPr>
+        <w:t>func</w:t>
+      </w:r>
+      <w:proofErr w:type="spellEnd"/>
+      <w:r>
+        <w:rPr>
+          <w:sz w:val="52"/>
+          <w:szCs w:val="52"/>
+        </w:rPr>
+        <w:t xml:space="preserve"> to quit game when </w:t>
+      </w:r>
+      <w:proofErr w:type="spellStart"/>
+      <w:r>
+        <w:rPr>
+          <w:sz w:val="52"/>
+          <w:szCs w:val="52"/>
+        </w:rPr>
+        <w:t>quit_game</w:t>
+      </w:r>
+      <w:proofErr w:type="spellEnd"/>
+      <w:r>
+        <w:rPr>
+          <w:sz w:val="52"/>
+          <w:szCs w:val="52"/>
+        </w:rPr>
+        <w:t xml:space="preserve"> signal is emitted.</w:t>
       </w:r>
     </w:p>
     <w:p>
@@ -177,7 +292,39 @@
           <w:sz w:val="52"/>
           <w:szCs w:val="52"/>
         </w:rPr>
-        <w:t>Create func that is connected to quiz_finished.</w:t>
+        <w:t xml:space="preserve">Create </w:t>
+      </w:r>
+      <w:proofErr w:type="spellStart"/>
+      <w:r>
+        <w:rPr>
+          <w:sz w:val="52"/>
+          <w:szCs w:val="52"/>
+        </w:rPr>
+        <w:t>func</w:t>
+      </w:r>
+      <w:proofErr w:type="spellEnd"/>
+      <w:r>
+        <w:rPr>
+          <w:sz w:val="52"/>
+          <w:szCs w:val="52"/>
+        </w:rPr>
+        <w:t xml:space="preserve"> that is connected to </w:t>
+      </w:r>
+      <w:proofErr w:type="spellStart"/>
+      <w:r>
+        <w:rPr>
+          <w:sz w:val="52"/>
+          <w:szCs w:val="52"/>
+        </w:rPr>
+        <w:t>quiz_finished</w:t>
+      </w:r>
+      <w:proofErr w:type="spellEnd"/>
+      <w:r>
+        <w:rPr>
+          <w:sz w:val="52"/>
+          <w:szCs w:val="52"/>
+        </w:rPr>
+        <w:t>.</w:t>
       </w:r>
     </w:p>
     <w:p>
@@ -293,9 +440,8 @@
     </w:p>
     <w:p>
       <w:pPr>
-        <w:pStyle w:val="ListParagraph"/>
-        <w:ind w:left="1440"/>
-        <w:rPr>
+        <w:rPr>
+          <w:color w:val="E97132" w:themeColor="accent2"/>
           <w:sz w:val="52"/>
           <w:szCs w:val="52"/>
         </w:rPr>
@@ -309,17 +455,21 @@
           <w:numId w:val="2"/>
         </w:numPr>
         <w:rPr>
-          <w:sz w:val="52"/>
-          <w:szCs w:val="52"/>
-        </w:rPr>
-      </w:pPr>
-      <w:r>
-        <w:rPr>
+          <w:color w:val="000000" w:themeColor="text1"/>
+          <w:sz w:val="52"/>
+          <w:szCs w:val="52"/>
+        </w:rPr>
+      </w:pPr>
+      <w:proofErr w:type="spellStart"/>
+      <w:r>
+        <w:rPr>
+          <w:color w:val="000000" w:themeColor="text1"/>
           <w:sz w:val="52"/>
           <w:szCs w:val="52"/>
         </w:rPr>
         <w:t>Pause_UI</w:t>
       </w:r>
+      <w:proofErr w:type="spellEnd"/>
     </w:p>
     <w:p>
       <w:pPr>
@@ -345,7 +495,23 @@
           <w:sz w:val="52"/>
           <w:szCs w:val="52"/>
         </w:rPr>
-        <w:t xml:space="preserve"> that emits quit_game signal when pressed.</w:t>
+        <w:t xml:space="preserve"> that emits </w:t>
+      </w:r>
+      <w:proofErr w:type="spellStart"/>
+      <w:r>
+        <w:rPr>
+          <w:sz w:val="52"/>
+          <w:szCs w:val="52"/>
+        </w:rPr>
+        <w:t>quit_game</w:t>
+      </w:r>
+      <w:proofErr w:type="spellEnd"/>
+      <w:r>
+        <w:rPr>
+          <w:sz w:val="52"/>
+          <w:szCs w:val="52"/>
+        </w:rPr>
+        <w:t xml:space="preserve"> signal when pressed.</w:t>
       </w:r>
     </w:p>
     <w:p>
@@ -372,8 +538,17 @@
           <w:sz w:val="52"/>
           <w:szCs w:val="52"/>
         </w:rPr>
-        <w:t>when quit button is presed</w:t>
-      </w:r>
+        <w:t xml:space="preserve">when quit button is </w:t>
+      </w:r>
+      <w:proofErr w:type="spellStart"/>
+      <w:r>
+        <w:rPr>
+          <w:sz w:val="52"/>
+          <w:szCs w:val="52"/>
+        </w:rPr>
+        <w:t>presed</w:t>
+      </w:r>
+      <w:proofErr w:type="spellEnd"/>
     </w:p>
     <w:p>
       <w:pPr>
@@ -471,7 +646,43 @@
           <w:sz w:val="52"/>
           <w:szCs w:val="52"/>
         </w:rPr>
-        <w:t xml:space="preserve"> in signal hub and connect it to the unpause func in main.</w:t>
+        <w:t xml:space="preserve"> in signal hub and connect it to the </w:t>
+      </w:r>
+      <w:proofErr w:type="spellStart"/>
+      <w:r>
+        <w:rPr>
+          <w:color w:val="4EA72E" w:themeColor="accent6"/>
+          <w:sz w:val="52"/>
+          <w:szCs w:val="52"/>
+        </w:rPr>
+        <w:t>unpause</w:t>
+      </w:r>
+      <w:proofErr w:type="spellEnd"/>
+      <w:r>
+        <w:rPr>
+          <w:color w:val="4EA72E" w:themeColor="accent6"/>
+          <w:sz w:val="52"/>
+          <w:szCs w:val="52"/>
+        </w:rPr>
+        <w:t xml:space="preserve"> </w:t>
+      </w:r>
+      <w:proofErr w:type="spellStart"/>
+      <w:r>
+        <w:rPr>
+          <w:color w:val="4EA72E" w:themeColor="accent6"/>
+          <w:sz w:val="52"/>
+          <w:szCs w:val="52"/>
+        </w:rPr>
+        <w:t>func</w:t>
+      </w:r>
+      <w:proofErr w:type="spellEnd"/>
+      <w:r>
+        <w:rPr>
+          <w:color w:val="4EA72E" w:themeColor="accent6"/>
+          <w:sz w:val="52"/>
+          <w:szCs w:val="52"/>
+        </w:rPr>
+        <w:t xml:space="preserve"> in main.</w:t>
       </w:r>
     </w:p>
     <w:p>
@@ -491,7 +702,39 @@
           <w:sz w:val="52"/>
           <w:szCs w:val="52"/>
         </w:rPr>
-        <w:t>In UI scripted create a func to detect unhandled inputs. Check to see if the input even is the pause button. Emit the pause/unpause signal.</w:t>
+        <w:t xml:space="preserve">In UI scripted create a </w:t>
+      </w:r>
+      <w:proofErr w:type="spellStart"/>
+      <w:r>
+        <w:rPr>
+          <w:sz w:val="52"/>
+          <w:szCs w:val="52"/>
+        </w:rPr>
+        <w:t>func</w:t>
+      </w:r>
+      <w:proofErr w:type="spellEnd"/>
+      <w:r>
+        <w:rPr>
+          <w:sz w:val="52"/>
+          <w:szCs w:val="52"/>
+        </w:rPr>
+        <w:t xml:space="preserve"> to detect unhandled inputs. Check to see if the input even is the pause button. Emit the pause/</w:t>
+      </w:r>
+      <w:proofErr w:type="spellStart"/>
+      <w:r>
+        <w:rPr>
+          <w:sz w:val="52"/>
+          <w:szCs w:val="52"/>
+        </w:rPr>
+        <w:t>unpause</w:t>
+      </w:r>
+      <w:proofErr w:type="spellEnd"/>
+      <w:r>
+        <w:rPr>
+          <w:sz w:val="52"/>
+          <w:szCs w:val="52"/>
+        </w:rPr>
+        <w:t xml:space="preserve"> signal.</w:t>
       </w:r>
     </w:p>
     <w:p>
@@ -540,6 +783,15 @@
     </w:p>
     <w:p>
       <w:pPr>
+        <w:rPr>
+          <w:color w:val="E97132" w:themeColor="accent2"/>
+          <w:sz w:val="52"/>
+          <w:szCs w:val="52"/>
+        </w:rPr>
+      </w:pPr>
+    </w:p>
+    <w:p>
+      <w:pPr>
         <w:pStyle w:val="ListParagraph"/>
         <w:numPr>
           <w:ilvl w:val="0"/>
@@ -550,6 +802,7 @@
           <w:szCs w:val="52"/>
         </w:rPr>
       </w:pPr>
+      <w:proofErr w:type="spellStart"/>
       <w:r>
         <w:rPr>
           <w:sz w:val="52"/>
@@ -557,6 +810,7 @@
         </w:rPr>
         <w:t>Bed_Scene</w:t>
       </w:r>
+      <w:proofErr w:type="spellEnd"/>
     </w:p>
     <w:p>
       <w:pPr>
@@ -602,7 +856,23 @@
           <w:sz w:val="52"/>
           <w:szCs w:val="52"/>
         </w:rPr>
-        <w:t xml:space="preserve">Create a signal in signal hub and emit that signal in Bed_Scene when </w:t>
+        <w:t xml:space="preserve">Create a signal in signal hub and emit that signal in </w:t>
+      </w:r>
+      <w:proofErr w:type="spellStart"/>
+      <w:r>
+        <w:rPr>
+          <w:sz w:val="52"/>
+          <w:szCs w:val="52"/>
+        </w:rPr>
+        <w:t>Bed_Scene</w:t>
+      </w:r>
+      <w:proofErr w:type="spellEnd"/>
+      <w:r>
+        <w:rPr>
+          <w:sz w:val="52"/>
+          <w:szCs w:val="52"/>
+        </w:rPr>
+        <w:t xml:space="preserve"> when </w:t>
       </w:r>
       <w:r>
         <w:rPr>
@@ -610,7 +880,23 @@
           <w:szCs w:val="52"/>
         </w:rPr>
         <w:lastRenderedPageBreak/>
-        <w:t>a CharacterBody2D enters or leavescollision zone.</w:t>
+        <w:t xml:space="preserve">a CharacterBody2D enters or </w:t>
+      </w:r>
+      <w:proofErr w:type="spellStart"/>
+      <w:r>
+        <w:rPr>
+          <w:sz w:val="52"/>
+          <w:szCs w:val="52"/>
+        </w:rPr>
+        <w:t>leavescollision</w:t>
+      </w:r>
+      <w:proofErr w:type="spellEnd"/>
+      <w:r>
+        <w:rPr>
+          <w:sz w:val="52"/>
+          <w:szCs w:val="52"/>
+        </w:rPr>
+        <w:t xml:space="preserve"> zone.</w:t>
       </w:r>
     </w:p>
     <w:p>
@@ -630,8 +916,48 @@
           <w:sz w:val="52"/>
           <w:szCs w:val="52"/>
         </w:rPr>
-        <w:t>Establish var obj_name as “BED”, this should be emited with the signal above.</w:t>
-      </w:r>
+        <w:t xml:space="preserve">Establish var </w:t>
+      </w:r>
+      <w:proofErr w:type="spellStart"/>
+      <w:r>
+        <w:rPr>
+          <w:sz w:val="52"/>
+          <w:szCs w:val="52"/>
+        </w:rPr>
+        <w:t>obj_name</w:t>
+      </w:r>
+      <w:proofErr w:type="spellEnd"/>
+      <w:r>
+        <w:rPr>
+          <w:sz w:val="52"/>
+          <w:szCs w:val="52"/>
+        </w:rPr>
+        <w:t xml:space="preserve"> as “BED”, this should be </w:t>
+      </w:r>
+      <w:proofErr w:type="spellStart"/>
+      <w:r>
+        <w:rPr>
+          <w:sz w:val="52"/>
+          <w:szCs w:val="52"/>
+        </w:rPr>
+        <w:t>emited</w:t>
+      </w:r>
+      <w:proofErr w:type="spellEnd"/>
+      <w:r>
+        <w:rPr>
+          <w:sz w:val="52"/>
+          <w:szCs w:val="52"/>
+        </w:rPr>
+        <w:t xml:space="preserve"> with the signal above.</w:t>
+      </w:r>
+    </w:p>
+    <w:p>
+      <w:pPr>
+        <w:rPr>
+          <w:sz w:val="52"/>
+          <w:szCs w:val="52"/>
+        </w:rPr>
+      </w:pPr>
     </w:p>
     <w:p>
       <w:pPr>
@@ -690,7 +1016,23 @@
           <w:sz w:val="52"/>
           <w:szCs w:val="52"/>
         </w:rPr>
-        <w:t>Add it to ASL_Images w/in correct data base</w:t>
+        <w:t xml:space="preserve">Add it to </w:t>
+      </w:r>
+      <w:proofErr w:type="spellStart"/>
+      <w:r>
+        <w:rPr>
+          <w:sz w:val="52"/>
+          <w:szCs w:val="52"/>
+        </w:rPr>
+        <w:t>ASL_Images</w:t>
+      </w:r>
+      <w:proofErr w:type="spellEnd"/>
+      <w:r>
+        <w:rPr>
+          <w:sz w:val="52"/>
+          <w:szCs w:val="52"/>
+        </w:rPr>
+        <w:t xml:space="preserve"> w/in correct data base</w:t>
       </w:r>
     </w:p>
     <w:p>
@@ -710,8 +1052,33 @@
           <w:sz w:val="52"/>
           <w:szCs w:val="52"/>
         </w:rPr>
-        <w:t>Create a new ASLSign.tres w/ correct name for the sign. Ex. A would be named A_Sign.tres</w:t>
-      </w:r>
+        <w:t xml:space="preserve">Create a new </w:t>
+      </w:r>
+      <w:proofErr w:type="spellStart"/>
+      <w:r>
+        <w:rPr>
+          <w:sz w:val="52"/>
+          <w:szCs w:val="52"/>
+        </w:rPr>
+        <w:t>ASLSign.tres</w:t>
+      </w:r>
+      <w:proofErr w:type="spellEnd"/>
+      <w:r>
+        <w:rPr>
+          <w:sz w:val="52"/>
+          <w:szCs w:val="52"/>
+        </w:rPr>
+        <w:t xml:space="preserve"> w/ correct name for the sign. Ex. A would be named </w:t>
+      </w:r>
+      <w:proofErr w:type="spellStart"/>
+      <w:r>
+        <w:rPr>
+          <w:sz w:val="52"/>
+          <w:szCs w:val="52"/>
+        </w:rPr>
+        <w:t>A_Sign.tres</w:t>
+      </w:r>
+      <w:proofErr w:type="spellEnd"/>
     </w:p>
     <w:p>
       <w:pPr>
@@ -730,8 +1097,41 @@
           <w:sz w:val="52"/>
           <w:szCs w:val="52"/>
         </w:rPr>
-        <w:t>Edit the .tres with correct meaning, and correct meaning.</w:t>
-      </w:r>
+        <w:t xml:space="preserve">Edit </w:t>
+      </w:r>
+      <w:proofErr w:type="gramStart"/>
+      <w:r>
+        <w:rPr>
+          <w:sz w:val="52"/>
+          <w:szCs w:val="52"/>
+        </w:rPr>
+        <w:t>the .</w:t>
+      </w:r>
+      <w:proofErr w:type="spellStart"/>
+      <w:r>
+        <w:rPr>
+          <w:sz w:val="52"/>
+          <w:szCs w:val="52"/>
+        </w:rPr>
+        <w:t>tres</w:t>
+      </w:r>
+      <w:proofErr w:type="spellEnd"/>
+      <w:proofErr w:type="gramEnd"/>
+      <w:r>
+        <w:rPr>
+          <w:sz w:val="52"/>
+          <w:szCs w:val="52"/>
+        </w:rPr>
+        <w:t xml:space="preserve"> with correct meaning, and correct meaning.</w:t>
+      </w:r>
+    </w:p>
+    <w:p>
+      <w:pPr>
+        <w:rPr>
+          <w:sz w:val="52"/>
+          <w:szCs w:val="52"/>
+        </w:rPr>
+      </w:pPr>
     </w:p>
     <w:p>
       <w:pPr>
@@ -745,13 +1145,16 @@
           <w:szCs w:val="52"/>
         </w:rPr>
       </w:pPr>
-      <w:r>
-        <w:rPr>
-          <w:sz w:val="52"/>
-          <w:szCs w:val="52"/>
-        </w:rPr>
+      <w:proofErr w:type="spellStart"/>
+      <w:r>
+        <w:rPr>
+          <w:sz w:val="52"/>
+          <w:szCs w:val="52"/>
+        </w:rPr>
+        <w:lastRenderedPageBreak/>
         <w:t>ASL_Quiz_UI</w:t>
       </w:r>
+      <w:proofErr w:type="spellEnd"/>
     </w:p>
     <w:p>
       <w:pPr>
@@ -765,6 +1168,7 @@
           <w:szCs w:val="52"/>
         </w:rPr>
       </w:pPr>
+      <w:proofErr w:type="spellStart"/>
       <w:r>
         <w:rPr>
           <w:sz w:val="52"/>
@@ -772,6 +1176,7 @@
         </w:rPr>
         <w:t>Randomize_question_type</w:t>
       </w:r>
+      <w:proofErr w:type="spellEnd"/>
     </w:p>
     <w:p>
       <w:pPr>
@@ -790,9 +1195,452 @@
           <w:sz w:val="52"/>
           <w:szCs w:val="52"/>
         </w:rPr>
+        <w:t>Needs to randomly pick an image question or meaning question</w:t>
+      </w:r>
+    </w:p>
+    <w:p>
+      <w:pPr>
+        <w:pStyle w:val="ListParagraph"/>
+        <w:numPr>
+          <w:ilvl w:val="1"/>
+          <w:numId w:val="2"/>
+        </w:numPr>
+        <w:rPr>
+          <w:sz w:val="52"/>
+          <w:szCs w:val="52"/>
+        </w:rPr>
+      </w:pPr>
+      <w:proofErr w:type="spellStart"/>
+      <w:r>
+        <w:rPr>
+          <w:sz w:val="52"/>
+          <w:szCs w:val="52"/>
+        </w:rPr>
+        <w:t>make_</w:t>
+      </w:r>
+      <w:r>
+        <w:rPr>
+          <w:sz w:val="52"/>
+          <w:szCs w:val="52"/>
+        </w:rPr>
+        <w:t>MP</w:t>
+      </w:r>
+      <w:r>
+        <w:rPr>
+          <w:sz w:val="52"/>
+          <w:szCs w:val="52"/>
+        </w:rPr>
+        <w:t>_</w:t>
+      </w:r>
+      <w:proofErr w:type="gramStart"/>
+      <w:r>
+        <w:rPr>
+          <w:sz w:val="52"/>
+          <w:szCs w:val="52"/>
+        </w:rPr>
+        <w:t>question</w:t>
+      </w:r>
+      <w:proofErr w:type="spellEnd"/>
+      <w:r>
+        <w:rPr>
+          <w:sz w:val="52"/>
+          <w:szCs w:val="52"/>
+        </w:rPr>
+        <w:t>(</w:t>
+      </w:r>
+      <w:proofErr w:type="gramEnd"/>
+      <w:r>
+        <w:rPr>
+          <w:sz w:val="52"/>
+          <w:szCs w:val="52"/>
+        </w:rPr>
+        <w:t>)</w:t>
+      </w:r>
+    </w:p>
+    <w:p>
+      <w:pPr>
+        <w:pStyle w:val="ListParagraph"/>
+        <w:numPr>
+          <w:ilvl w:val="2"/>
+          <w:numId w:val="2"/>
+        </w:numPr>
+        <w:rPr>
+          <w:sz w:val="52"/>
+          <w:szCs w:val="52"/>
+        </w:rPr>
+      </w:pPr>
+      <w:r>
+        <w:rPr>
+          <w:sz w:val="52"/>
+          <w:szCs w:val="52"/>
+        </w:rPr>
+        <w:t>show/hide correct containers</w:t>
+      </w:r>
+    </w:p>
+    <w:p>
+      <w:pPr>
+        <w:pStyle w:val="ListParagraph"/>
+        <w:numPr>
+          <w:ilvl w:val="2"/>
+          <w:numId w:val="2"/>
+        </w:numPr>
+        <w:rPr>
+          <w:sz w:val="52"/>
+          <w:szCs w:val="52"/>
+        </w:rPr>
+      </w:pPr>
+      <w:r>
+        <w:rPr>
+          <w:sz w:val="52"/>
+          <w:szCs w:val="52"/>
+        </w:rPr>
+        <w:t xml:space="preserve">should </w:t>
+      </w:r>
+      <w:r>
+        <w:rPr>
+          <w:sz w:val="52"/>
+          <w:szCs w:val="52"/>
+        </w:rPr>
+        <w:t xml:space="preserve">store correct meaning in </w:t>
+      </w:r>
+      <w:proofErr w:type="spellStart"/>
+      <w:r>
+        <w:rPr>
+          <w:sz w:val="52"/>
+          <w:szCs w:val="52"/>
+        </w:rPr>
+        <w:t>meaning_prompt</w:t>
+      </w:r>
+      <w:proofErr w:type="spellEnd"/>
+    </w:p>
+    <w:p>
+      <w:pPr>
+        <w:pStyle w:val="ListParagraph"/>
+        <w:numPr>
+          <w:ilvl w:val="2"/>
+          <w:numId w:val="2"/>
+        </w:numPr>
+        <w:rPr>
+          <w:sz w:val="52"/>
+          <w:szCs w:val="52"/>
+        </w:rPr>
+      </w:pPr>
+      <w:r>
+        <w:rPr>
+          <w:sz w:val="52"/>
+          <w:szCs w:val="52"/>
+        </w:rPr>
+        <w:t xml:space="preserve">Should </w:t>
+      </w:r>
+      <w:r>
+        <w:rPr>
+          <w:sz w:val="52"/>
+          <w:szCs w:val="52"/>
+        </w:rPr>
+        <w:t>randomly store images of all 4 signs of question in I_</w:t>
+      </w:r>
+      <w:proofErr w:type="gramStart"/>
+      <w:r>
+        <w:rPr>
+          <w:sz w:val="52"/>
+          <w:szCs w:val="52"/>
+        </w:rPr>
+        <w:t>A,I</w:t>
+      </w:r>
+      <w:proofErr w:type="gramEnd"/>
+      <w:r>
+        <w:rPr>
+          <w:sz w:val="52"/>
+          <w:szCs w:val="52"/>
+        </w:rPr>
+        <w:t>_</w:t>
+      </w:r>
+      <w:proofErr w:type="gramStart"/>
+      <w:r>
+        <w:rPr>
+          <w:sz w:val="52"/>
+          <w:szCs w:val="52"/>
+        </w:rPr>
+        <w:t>B,I</w:t>
+      </w:r>
+      <w:proofErr w:type="gramEnd"/>
+      <w:r>
+        <w:rPr>
+          <w:sz w:val="52"/>
+          <w:szCs w:val="52"/>
+        </w:rPr>
+        <w:t>_C, and I_D.</w:t>
+      </w:r>
+    </w:p>
+    <w:p>
+      <w:pPr>
+        <w:pStyle w:val="ListParagraph"/>
+        <w:numPr>
+          <w:ilvl w:val="3"/>
+          <w:numId w:val="2"/>
+        </w:numPr>
+        <w:rPr>
+          <w:sz w:val="52"/>
+          <w:szCs w:val="52"/>
+        </w:rPr>
+      </w:pPr>
+      <w:r>
+        <w:rPr>
+          <w:sz w:val="52"/>
+          <w:szCs w:val="52"/>
+        </w:rPr>
+        <w:t xml:space="preserve">Should assign </w:t>
+      </w:r>
+      <w:proofErr w:type="gramStart"/>
+      <w:r>
+        <w:rPr>
+          <w:sz w:val="52"/>
+          <w:szCs w:val="52"/>
+        </w:rPr>
+        <w:t>A,B</w:t>
+      </w:r>
+      <w:proofErr w:type="gramEnd"/>
+      <w:r>
+        <w:rPr>
+          <w:sz w:val="52"/>
+          <w:szCs w:val="52"/>
+        </w:rPr>
+        <w:t xml:space="preserve">,C, or D to </w:t>
+      </w:r>
+      <w:proofErr w:type="spellStart"/>
+      <w:r>
+        <w:rPr>
+          <w:sz w:val="52"/>
+          <w:szCs w:val="52"/>
+        </w:rPr>
+        <w:t>correct_answer</w:t>
+      </w:r>
+      <w:proofErr w:type="spellEnd"/>
+    </w:p>
+    <w:p>
+      <w:pPr>
+        <w:rPr>
+          <w:sz w:val="52"/>
+          <w:szCs w:val="52"/>
+        </w:rPr>
+      </w:pPr>
+    </w:p>
+    <w:p>
+      <w:pPr>
+        <w:pStyle w:val="ListParagraph"/>
+        <w:numPr>
+          <w:ilvl w:val="1"/>
+          <w:numId w:val="2"/>
+        </w:numPr>
+        <w:rPr>
+          <w:sz w:val="52"/>
+          <w:szCs w:val="52"/>
+        </w:rPr>
+      </w:pPr>
+      <w:proofErr w:type="spellStart"/>
+      <w:r>
+        <w:rPr>
+          <w:sz w:val="52"/>
+          <w:szCs w:val="52"/>
+        </w:rPr>
+        <w:t>make_IP_</w:t>
+      </w:r>
+      <w:proofErr w:type="gramStart"/>
+      <w:r>
+        <w:rPr>
+          <w:sz w:val="52"/>
+          <w:szCs w:val="52"/>
+        </w:rPr>
+        <w:t>question</w:t>
+      </w:r>
+      <w:proofErr w:type="spellEnd"/>
+      <w:r>
+        <w:rPr>
+          <w:sz w:val="52"/>
+          <w:szCs w:val="52"/>
+        </w:rPr>
+        <w:t>(</w:t>
+      </w:r>
+      <w:proofErr w:type="gramEnd"/>
+      <w:r>
+        <w:rPr>
+          <w:sz w:val="52"/>
+          <w:szCs w:val="52"/>
+        </w:rPr>
+        <w:t>)</w:t>
+      </w:r>
+    </w:p>
+    <w:p>
+      <w:pPr>
+        <w:pStyle w:val="ListParagraph"/>
+        <w:numPr>
+          <w:ilvl w:val="2"/>
+          <w:numId w:val="2"/>
+        </w:numPr>
+        <w:rPr>
+          <w:sz w:val="52"/>
+          <w:szCs w:val="52"/>
+        </w:rPr>
+      </w:pPr>
+      <w:r>
+        <w:rPr>
+          <w:sz w:val="52"/>
+          <w:szCs w:val="52"/>
+        </w:rPr>
+        <w:t>show/hide correct containers</w:t>
+      </w:r>
+    </w:p>
+    <w:p>
+      <w:pPr>
+        <w:pStyle w:val="ListParagraph"/>
+        <w:numPr>
+          <w:ilvl w:val="2"/>
+          <w:numId w:val="2"/>
+        </w:numPr>
+        <w:rPr>
+          <w:sz w:val="52"/>
+          <w:szCs w:val="52"/>
+        </w:rPr>
+      </w:pPr>
+      <w:r>
+        <w:rPr>
+          <w:sz w:val="52"/>
+          <w:szCs w:val="52"/>
+        </w:rPr>
         <w:lastRenderedPageBreak/>
-        <w:t>Needs to randomly pick an image question or meaning question</w:t>
-      </w:r>
+        <w:t xml:space="preserve">should store correct image in </w:t>
+      </w:r>
+      <w:proofErr w:type="spellStart"/>
+      <w:r>
+        <w:rPr>
+          <w:sz w:val="52"/>
+          <w:szCs w:val="52"/>
+        </w:rPr>
+        <w:t>image_prompt</w:t>
+      </w:r>
+      <w:proofErr w:type="spellEnd"/>
+    </w:p>
+    <w:p>
+      <w:pPr>
+        <w:pStyle w:val="ListParagraph"/>
+        <w:numPr>
+          <w:ilvl w:val="2"/>
+          <w:numId w:val="2"/>
+        </w:numPr>
+        <w:rPr>
+          <w:sz w:val="52"/>
+          <w:szCs w:val="52"/>
+        </w:rPr>
+      </w:pPr>
+      <w:r>
+        <w:rPr>
+          <w:sz w:val="52"/>
+          <w:szCs w:val="52"/>
+        </w:rPr>
+        <w:t xml:space="preserve">should randomly store meanings of all 4 signs of question in </w:t>
+      </w:r>
+      <w:proofErr w:type="spellStart"/>
+      <w:r>
+        <w:rPr>
+          <w:sz w:val="52"/>
+          <w:szCs w:val="52"/>
+        </w:rPr>
+        <w:t>Meaning_</w:t>
+      </w:r>
+      <w:proofErr w:type="gramStart"/>
+      <w:r>
+        <w:rPr>
+          <w:sz w:val="52"/>
+          <w:szCs w:val="52"/>
+        </w:rPr>
+        <w:t>A,Meaning</w:t>
+      </w:r>
+      <w:proofErr w:type="gramEnd"/>
+      <w:r>
+        <w:rPr>
+          <w:sz w:val="52"/>
+          <w:szCs w:val="52"/>
+        </w:rPr>
+        <w:t>_</w:t>
+      </w:r>
+      <w:proofErr w:type="gramStart"/>
+      <w:r>
+        <w:rPr>
+          <w:sz w:val="52"/>
+          <w:szCs w:val="52"/>
+        </w:rPr>
+        <w:t>B,Meaning</w:t>
+      </w:r>
+      <w:proofErr w:type="gramEnd"/>
+      <w:r>
+        <w:rPr>
+          <w:sz w:val="52"/>
+          <w:szCs w:val="52"/>
+        </w:rPr>
+        <w:t>_C</w:t>
+      </w:r>
+      <w:proofErr w:type="spellEnd"/>
+      <w:r>
+        <w:rPr>
+          <w:sz w:val="52"/>
+          <w:szCs w:val="52"/>
+        </w:rPr>
+        <w:t xml:space="preserve">, and </w:t>
+      </w:r>
+      <w:proofErr w:type="spellStart"/>
+      <w:r>
+        <w:rPr>
+          <w:sz w:val="52"/>
+          <w:szCs w:val="52"/>
+        </w:rPr>
+        <w:t>Meaning_D</w:t>
+      </w:r>
+      <w:proofErr w:type="spellEnd"/>
+    </w:p>
+    <w:p>
+      <w:pPr>
+        <w:pStyle w:val="ListParagraph"/>
+        <w:numPr>
+          <w:ilvl w:val="2"/>
+          <w:numId w:val="2"/>
+        </w:numPr>
+        <w:rPr>
+          <w:sz w:val="52"/>
+          <w:szCs w:val="52"/>
+        </w:rPr>
+      </w:pPr>
+      <w:r>
+        <w:rPr>
+          <w:sz w:val="52"/>
+          <w:szCs w:val="52"/>
+        </w:rPr>
+        <w:t xml:space="preserve">should assign </w:t>
+      </w:r>
+      <w:proofErr w:type="gramStart"/>
+      <w:r>
+        <w:rPr>
+          <w:sz w:val="52"/>
+          <w:szCs w:val="52"/>
+        </w:rPr>
+        <w:t>A,B</w:t>
+      </w:r>
+      <w:proofErr w:type="gramEnd"/>
+      <w:r>
+        <w:rPr>
+          <w:sz w:val="52"/>
+          <w:szCs w:val="52"/>
+        </w:rPr>
+        <w:t xml:space="preserve">,C, or D to </w:t>
+      </w:r>
+      <w:proofErr w:type="spellStart"/>
+      <w:r>
+        <w:rPr>
+          <w:sz w:val="52"/>
+          <w:szCs w:val="52"/>
+        </w:rPr>
+        <w:t>correct_answer</w:t>
+      </w:r>
+      <w:proofErr w:type="spellEnd"/>
     </w:p>
     <w:p>
       <w:pPr>
@@ -806,26 +1654,37 @@
           <w:szCs w:val="52"/>
         </w:rPr>
       </w:pPr>
-      <w:r>
-        <w:rPr>
-          <w:sz w:val="52"/>
-          <w:szCs w:val="52"/>
-        </w:rPr>
-        <w:t>make_</w:t>
-      </w:r>
-      <w:r>
-        <w:rPr>
-          <w:sz w:val="52"/>
-          <w:szCs w:val="52"/>
-        </w:rPr>
-        <w:t>MP</w:t>
-      </w:r>
-      <w:r>
-        <w:rPr>
-          <w:sz w:val="52"/>
-          <w:szCs w:val="52"/>
-        </w:rPr>
-        <w:t>_question()</w:t>
+      <w:proofErr w:type="spellStart"/>
+      <w:r>
+        <w:rPr>
+          <w:sz w:val="52"/>
+          <w:szCs w:val="52"/>
+        </w:rPr>
+        <w:t>answer_</w:t>
+      </w:r>
+      <w:proofErr w:type="gramStart"/>
+      <w:r>
+        <w:rPr>
+          <w:sz w:val="52"/>
+          <w:szCs w:val="52"/>
+        </w:rPr>
+        <w:t>picked</w:t>
+      </w:r>
+      <w:proofErr w:type="spellEnd"/>
+      <w:r>
+        <w:rPr>
+          <w:sz w:val="52"/>
+          <w:szCs w:val="52"/>
+        </w:rPr>
+        <w:t>(</w:t>
+      </w:r>
+      <w:proofErr w:type="gramEnd"/>
+      <w:r>
+        <w:rPr>
+          <w:sz w:val="52"/>
+          <w:szCs w:val="52"/>
+        </w:rPr>
+        <w:t>String)</w:t>
       </w:r>
     </w:p>
     <w:p>
@@ -845,7 +1704,77 @@
           <w:sz w:val="52"/>
           <w:szCs w:val="52"/>
         </w:rPr>
-        <w:t>show/hide correct containers</w:t>
+        <w:t xml:space="preserve">needs to compare selected _answer to </w:t>
+      </w:r>
+      <w:proofErr w:type="spellStart"/>
+      <w:r>
+        <w:rPr>
+          <w:sz w:val="52"/>
+          <w:szCs w:val="52"/>
+        </w:rPr>
+        <w:t>correct_answer</w:t>
+      </w:r>
+      <w:proofErr w:type="spellEnd"/>
+      <w:r>
+        <w:rPr>
+          <w:sz w:val="52"/>
+          <w:szCs w:val="52"/>
+        </w:rPr>
+        <w:t xml:space="preserve"> and increment.</w:t>
+      </w:r>
+    </w:p>
+    <w:p>
+      <w:pPr>
+        <w:pStyle w:val="ListParagraph"/>
+        <w:numPr>
+          <w:ilvl w:val="1"/>
+          <w:numId w:val="2"/>
+        </w:numPr>
+        <w:rPr>
+          <w:sz w:val="52"/>
+          <w:szCs w:val="52"/>
+        </w:rPr>
+      </w:pPr>
+      <w:proofErr w:type="spellStart"/>
+      <w:r>
+        <w:rPr>
+          <w:sz w:val="52"/>
+          <w:szCs w:val="52"/>
+        </w:rPr>
+        <w:t>Start_</w:t>
+      </w:r>
+      <w:proofErr w:type="gramStart"/>
+      <w:r>
+        <w:rPr>
+          <w:sz w:val="52"/>
+          <w:szCs w:val="52"/>
+        </w:rPr>
+        <w:t>quiz</w:t>
+      </w:r>
+      <w:proofErr w:type="spellEnd"/>
+      <w:r>
+        <w:rPr>
+          <w:sz w:val="52"/>
+          <w:szCs w:val="52"/>
+        </w:rPr>
+        <w:t>(Array[</w:t>
+      </w:r>
+      <w:proofErr w:type="spellStart"/>
+      <w:proofErr w:type="gramEnd"/>
+      <w:r>
+        <w:rPr>
+          <w:sz w:val="52"/>
+          <w:szCs w:val="52"/>
+        </w:rPr>
+        <w:t>ASLQuestion</w:t>
+      </w:r>
+      <w:proofErr w:type="spellEnd"/>
+      <w:r>
+        <w:rPr>
+          <w:sz w:val="52"/>
+          <w:szCs w:val="52"/>
+        </w:rPr>
+        <w:t>])</w:t>
       </w:r>
     </w:p>
     <w:p>
@@ -865,14 +1794,7 @@
           <w:sz w:val="52"/>
           <w:szCs w:val="52"/>
         </w:rPr>
-        <w:t xml:space="preserve">should </w:t>
-      </w:r>
-      <w:r>
-        <w:rPr>
-          <w:sz w:val="52"/>
-          <w:szCs w:val="52"/>
-        </w:rPr>
-        <w:t>store correct meaning in meaning_prompt</w:t>
+        <w:t>Should randomize the type of question displayed</w:t>
       </w:r>
     </w:p>
     <w:p>
@@ -892,15 +1814,165 @@
           <w:sz w:val="52"/>
           <w:szCs w:val="52"/>
         </w:rPr>
-        <w:t xml:space="preserve">Should </w:t>
-      </w:r>
-      <w:r>
-        <w:rPr>
-          <w:sz w:val="52"/>
-          <w:szCs w:val="52"/>
-        </w:rPr>
-        <w:t>randomly store images of all 4 signs of question in I_A,I_B,I_C, and I_D.</w:t>
-      </w:r>
+        <w:lastRenderedPageBreak/>
+        <w:t>Should pause cycling through the array of questions until player selects an answer to each question</w:t>
+      </w:r>
+    </w:p>
+    <w:p>
+      <w:pPr>
+        <w:pStyle w:val="ListParagraph"/>
+        <w:numPr>
+          <w:ilvl w:val="2"/>
+          <w:numId w:val="2"/>
+        </w:numPr>
+        <w:rPr>
+          <w:sz w:val="52"/>
+          <w:szCs w:val="52"/>
+        </w:rPr>
+      </w:pPr>
+      <w:r>
+        <w:rPr>
+          <w:sz w:val="52"/>
+          <w:szCs w:val="52"/>
+        </w:rPr>
+        <w:t xml:space="preserve">Should run </w:t>
+      </w:r>
+      <w:proofErr w:type="spellStart"/>
+      <w:r>
+        <w:rPr>
+          <w:sz w:val="52"/>
+          <w:szCs w:val="52"/>
+        </w:rPr>
+        <w:t>quiz_</w:t>
+      </w:r>
+      <w:proofErr w:type="gramStart"/>
+      <w:r>
+        <w:rPr>
+          <w:sz w:val="52"/>
+          <w:szCs w:val="52"/>
+        </w:rPr>
+        <w:t>finished</w:t>
+      </w:r>
+      <w:proofErr w:type="spellEnd"/>
+      <w:r>
+        <w:rPr>
+          <w:sz w:val="52"/>
+          <w:szCs w:val="52"/>
+        </w:rPr>
+        <w:t>(</w:t>
+      </w:r>
+      <w:proofErr w:type="gramEnd"/>
+      <w:r>
+        <w:rPr>
+          <w:sz w:val="52"/>
+          <w:szCs w:val="52"/>
+        </w:rPr>
+        <w:t>)</w:t>
+      </w:r>
+    </w:p>
+    <w:p>
+      <w:pPr>
+        <w:pStyle w:val="ListParagraph"/>
+        <w:numPr>
+          <w:ilvl w:val="1"/>
+          <w:numId w:val="2"/>
+        </w:numPr>
+        <w:rPr>
+          <w:sz w:val="52"/>
+          <w:szCs w:val="52"/>
+        </w:rPr>
+      </w:pPr>
+      <w:proofErr w:type="spellStart"/>
+      <w:r>
+        <w:rPr>
+          <w:sz w:val="52"/>
+          <w:szCs w:val="52"/>
+        </w:rPr>
+        <w:t>quiz_</w:t>
+      </w:r>
+      <w:proofErr w:type="gramStart"/>
+      <w:r>
+        <w:rPr>
+          <w:sz w:val="52"/>
+          <w:szCs w:val="52"/>
+        </w:rPr>
+        <w:t>finished</w:t>
+      </w:r>
+      <w:proofErr w:type="spellEnd"/>
+      <w:r>
+        <w:rPr>
+          <w:sz w:val="52"/>
+          <w:szCs w:val="52"/>
+        </w:rPr>
+        <w:t>(</w:t>
+      </w:r>
+      <w:proofErr w:type="gramEnd"/>
+      <w:r>
+        <w:rPr>
+          <w:sz w:val="52"/>
+          <w:szCs w:val="52"/>
+        </w:rPr>
+        <w:t>)</w:t>
+      </w:r>
+    </w:p>
+    <w:p>
+      <w:pPr>
+        <w:pStyle w:val="ListParagraph"/>
+        <w:numPr>
+          <w:ilvl w:val="2"/>
+          <w:numId w:val="2"/>
+        </w:numPr>
+        <w:rPr>
+          <w:sz w:val="52"/>
+          <w:szCs w:val="52"/>
+        </w:rPr>
+      </w:pPr>
+      <w:r>
+        <w:rPr>
+          <w:sz w:val="52"/>
+          <w:szCs w:val="52"/>
+        </w:rPr>
+        <w:t xml:space="preserve">Should emit a signal </w:t>
+      </w:r>
+      <w:r>
+        <w:rPr>
+          <w:sz w:val="52"/>
+          <w:szCs w:val="52"/>
+        </w:rPr>
+        <w:t>with</w:t>
+      </w:r>
+      <w:r>
+        <w:rPr>
+          <w:sz w:val="52"/>
+          <w:szCs w:val="52"/>
+        </w:rPr>
+        <w:t xml:space="preserve"> </w:t>
+      </w:r>
+      <w:proofErr w:type="spellStart"/>
+      <w:r>
+        <w:rPr>
+          <w:sz w:val="52"/>
+          <w:szCs w:val="52"/>
+        </w:rPr>
+        <w:t>answered_correclty</w:t>
+      </w:r>
+      <w:proofErr w:type="spellEnd"/>
+      <w:r>
+        <w:rPr>
+          <w:sz w:val="52"/>
+          <w:szCs w:val="52"/>
+        </w:rPr>
+        <w:t xml:space="preserve"> through signal </w:t>
+      </w:r>
+      <w:proofErr w:type="gramStart"/>
+      <w:r>
+        <w:rPr>
+          <w:sz w:val="52"/>
+          <w:szCs w:val="52"/>
+        </w:rPr>
+        <w:t>hub .</w:t>
+      </w:r>
+      <w:proofErr w:type="gramEnd"/>
     </w:p>
     <w:p>
       <w:pPr>
@@ -919,7 +1991,47 @@
           <w:sz w:val="52"/>
           <w:szCs w:val="52"/>
         </w:rPr>
-        <w:t>Should assign A,B,C, or D to correct_answer</w:t>
+        <w:t>Need to create signal in signal hub first that holds an int.</w:t>
+      </w:r>
+    </w:p>
+    <w:p>
+      <w:pPr>
+        <w:pStyle w:val="ListParagraph"/>
+        <w:numPr>
+          <w:ilvl w:val="2"/>
+          <w:numId w:val="2"/>
+        </w:numPr>
+        <w:rPr>
+          <w:sz w:val="52"/>
+          <w:szCs w:val="52"/>
+        </w:rPr>
+      </w:pPr>
+      <w:r>
+        <w:rPr>
+          <w:sz w:val="52"/>
+          <w:szCs w:val="52"/>
+        </w:rPr>
+        <w:t>Should hide all containers</w:t>
+      </w:r>
+    </w:p>
+    <w:p>
+      <w:pPr>
+        <w:pStyle w:val="ListParagraph"/>
+        <w:numPr>
+          <w:ilvl w:val="0"/>
+          <w:numId w:val="2"/>
+        </w:numPr>
+        <w:rPr>
+          <w:sz w:val="52"/>
+          <w:szCs w:val="52"/>
+        </w:rPr>
+      </w:pPr>
+      <w:r>
+        <w:rPr>
+          <w:sz w:val="52"/>
+          <w:szCs w:val="52"/>
+        </w:rPr>
+        <w:t>Farm Scene</w:t>
       </w:r>
     </w:p>
     <w:p>
@@ -939,7 +2051,44 @@
           <w:sz w:val="52"/>
           <w:szCs w:val="52"/>
         </w:rPr>
-        <w:t>make_IP_question()</w:t>
+        <w:t>Need to instantiate 3 Tree’s, assign difficulty levels, 3 levels of growth, and name (TREE</w:t>
+      </w:r>
+      <w:proofErr w:type="gramStart"/>
+      <w:r>
+        <w:rPr>
+          <w:sz w:val="52"/>
+          <w:szCs w:val="52"/>
+        </w:rPr>
+        <w:t>1,TREE2,TREE</w:t>
+      </w:r>
+      <w:proofErr w:type="gramEnd"/>
+      <w:r>
+        <w:rPr>
+          <w:sz w:val="52"/>
+          <w:szCs w:val="52"/>
+        </w:rPr>
+        <w:t>3)</w:t>
+      </w:r>
+    </w:p>
+    <w:p>
+      <w:pPr>
+        <w:pStyle w:val="ListParagraph"/>
+        <w:numPr>
+          <w:ilvl w:val="1"/>
+          <w:numId w:val="2"/>
+        </w:numPr>
+        <w:rPr>
+          <w:sz w:val="52"/>
+          <w:szCs w:val="52"/>
+        </w:rPr>
+      </w:pPr>
+      <w:r>
+        <w:rPr>
+          <w:sz w:val="52"/>
+          <w:szCs w:val="52"/>
+        </w:rPr>
+        <w:lastRenderedPageBreak/>
+        <w:t>Need to get scene background</w:t>
       </w:r>
     </w:p>
     <w:p>
@@ -959,7 +2108,77 @@
           <w:sz w:val="52"/>
           <w:szCs w:val="52"/>
         </w:rPr>
-        <w:t>show/hide correct containers</w:t>
+        <w:t>Should have a farm area and a home area</w:t>
+      </w:r>
+    </w:p>
+    <w:p>
+      <w:pPr>
+        <w:pStyle w:val="ListParagraph"/>
+        <w:numPr>
+          <w:ilvl w:val="1"/>
+          <w:numId w:val="2"/>
+        </w:numPr>
+        <w:rPr>
+          <w:sz w:val="52"/>
+          <w:szCs w:val="52"/>
+        </w:rPr>
+      </w:pPr>
+      <w:r>
+        <w:rPr>
+          <w:sz w:val="52"/>
+          <w:szCs w:val="52"/>
+        </w:rPr>
+        <w:t xml:space="preserve">Need to add area2D node to scene w/ corresponding </w:t>
+      </w:r>
+      <w:r>
+        <w:rPr>
+          <w:sz w:val="52"/>
+          <w:szCs w:val="52"/>
+        </w:rPr>
+        <w:t xml:space="preserve">CollisionShape2d </w:t>
+      </w:r>
+      <w:r>
+        <w:rPr>
+          <w:sz w:val="52"/>
+          <w:szCs w:val="52"/>
+        </w:rPr>
+        <w:t xml:space="preserve">called </w:t>
+      </w:r>
+      <w:proofErr w:type="spellStart"/>
+      <w:r>
+        <w:rPr>
+          <w:sz w:val="52"/>
+          <w:szCs w:val="52"/>
+        </w:rPr>
+        <w:t>door_to_home</w:t>
+      </w:r>
+      <w:proofErr w:type="spellEnd"/>
+      <w:r>
+        <w:rPr>
+          <w:sz w:val="52"/>
+          <w:szCs w:val="52"/>
+        </w:rPr>
+        <w:t>.</w:t>
+      </w:r>
+    </w:p>
+    <w:p>
+      <w:pPr>
+        <w:pStyle w:val="ListParagraph"/>
+        <w:numPr>
+          <w:ilvl w:val="1"/>
+          <w:numId w:val="2"/>
+        </w:numPr>
+        <w:rPr>
+          <w:sz w:val="52"/>
+          <w:szCs w:val="52"/>
+        </w:rPr>
+      </w:pPr>
+      <w:r>
+        <w:rPr>
+          <w:sz w:val="52"/>
+          <w:szCs w:val="52"/>
+        </w:rPr>
+        <w:t>Need to add StaticBody2D nodes w/ corresponding CollisionShape2D.</w:t>
       </w:r>
     </w:p>
     <w:p>
@@ -979,7 +2198,7 @@
           <w:sz w:val="52"/>
           <w:szCs w:val="52"/>
         </w:rPr>
-        <w:t>should store correct image in image_prompt</w:t>
+        <w:t>Stop player from walking on top of home.</w:t>
       </w:r>
     </w:p>
     <w:p>
@@ -999,8 +2218,182 @@
           <w:sz w:val="52"/>
           <w:szCs w:val="52"/>
         </w:rPr>
+        <w:t>Set world boundaries to stop player from walking out of the map.</w:t>
+      </w:r>
+    </w:p>
+    <w:p>
+      <w:pPr>
+        <w:pStyle w:val="ListParagraph"/>
+        <w:numPr>
+          <w:ilvl w:val="1"/>
+          <w:numId w:val="2"/>
+        </w:numPr>
+        <w:rPr>
+          <w:sz w:val="52"/>
+          <w:szCs w:val="52"/>
+        </w:rPr>
+      </w:pPr>
+      <w:r>
+        <w:rPr>
+          <w:sz w:val="52"/>
+          <w:szCs w:val="52"/>
+        </w:rPr>
         <w:lastRenderedPageBreak/>
-        <w:t>should randomly store meanings of all 4 signs of question in Meaning_A,Meaning_B,Meaning_C, and Meaning_D</w:t>
+        <w:t xml:space="preserve">Create script that emits a signal when a CharacterBody2D enters </w:t>
+      </w:r>
+      <w:proofErr w:type="spellStart"/>
+      <w:r>
+        <w:rPr>
+          <w:sz w:val="52"/>
+          <w:szCs w:val="52"/>
+        </w:rPr>
+        <w:t>door_to_home</w:t>
+      </w:r>
+      <w:proofErr w:type="spellEnd"/>
+      <w:r>
+        <w:rPr>
+          <w:sz w:val="52"/>
+          <w:szCs w:val="52"/>
+        </w:rPr>
+        <w:t>.</w:t>
+      </w:r>
+    </w:p>
+    <w:p>
+      <w:pPr>
+        <w:rPr>
+          <w:sz w:val="52"/>
+          <w:szCs w:val="52"/>
+        </w:rPr>
+      </w:pPr>
+    </w:p>
+    <w:p>
+      <w:pPr>
+        <w:pStyle w:val="ListParagraph"/>
+        <w:numPr>
+          <w:ilvl w:val="0"/>
+          <w:numId w:val="2"/>
+        </w:numPr>
+        <w:rPr>
+          <w:sz w:val="52"/>
+          <w:szCs w:val="52"/>
+        </w:rPr>
+      </w:pPr>
+      <w:r>
+        <w:rPr>
+          <w:sz w:val="52"/>
+          <w:szCs w:val="52"/>
+        </w:rPr>
+        <w:t>Home scene</w:t>
+      </w:r>
+    </w:p>
+    <w:p>
+      <w:pPr>
+        <w:pStyle w:val="ListParagraph"/>
+        <w:numPr>
+          <w:ilvl w:val="1"/>
+          <w:numId w:val="2"/>
+        </w:numPr>
+        <w:rPr>
+          <w:sz w:val="52"/>
+          <w:szCs w:val="52"/>
+        </w:rPr>
+      </w:pPr>
+      <w:r>
+        <w:rPr>
+          <w:sz w:val="52"/>
+          <w:szCs w:val="52"/>
+        </w:rPr>
+        <w:t xml:space="preserve">Need to instantiate </w:t>
+      </w:r>
+      <w:r>
+        <w:rPr>
+          <w:sz w:val="52"/>
+          <w:szCs w:val="52"/>
+        </w:rPr>
+        <w:t>Newspaper and Bed</w:t>
+      </w:r>
+    </w:p>
+    <w:p>
+      <w:pPr>
+        <w:pStyle w:val="ListParagraph"/>
+        <w:numPr>
+          <w:ilvl w:val="1"/>
+          <w:numId w:val="2"/>
+        </w:numPr>
+        <w:rPr>
+          <w:sz w:val="52"/>
+          <w:szCs w:val="52"/>
+        </w:rPr>
+      </w:pPr>
+      <w:r>
+        <w:rPr>
+          <w:sz w:val="52"/>
+          <w:szCs w:val="52"/>
+        </w:rPr>
+        <w:t>Need to get scene background</w:t>
+      </w:r>
+    </w:p>
+    <w:p>
+      <w:pPr>
+        <w:pStyle w:val="ListParagraph"/>
+        <w:numPr>
+          <w:ilvl w:val="1"/>
+          <w:numId w:val="2"/>
+        </w:numPr>
+        <w:rPr>
+          <w:sz w:val="52"/>
+          <w:szCs w:val="52"/>
+        </w:rPr>
+      </w:pPr>
+      <w:r>
+        <w:rPr>
+          <w:sz w:val="52"/>
+          <w:szCs w:val="52"/>
+        </w:rPr>
+        <w:t xml:space="preserve">Need to add area2D node to scene w/ corresponding CollisionShape2d called </w:t>
+      </w:r>
+      <w:proofErr w:type="spellStart"/>
+      <w:r>
+        <w:rPr>
+          <w:sz w:val="52"/>
+          <w:szCs w:val="52"/>
+        </w:rPr>
+        <w:t>door_to</w:t>
+      </w:r>
+      <w:r>
+        <w:rPr>
+          <w:sz w:val="52"/>
+          <w:szCs w:val="52"/>
+        </w:rPr>
+        <w:t>_farm</w:t>
+      </w:r>
+      <w:proofErr w:type="spellEnd"/>
+      <w:r>
+        <w:rPr>
+          <w:sz w:val="52"/>
+          <w:szCs w:val="52"/>
+        </w:rPr>
+        <w:t>,</w:t>
+      </w:r>
+    </w:p>
+    <w:p>
+      <w:pPr>
+        <w:pStyle w:val="ListParagraph"/>
+        <w:numPr>
+          <w:ilvl w:val="1"/>
+          <w:numId w:val="2"/>
+        </w:numPr>
+        <w:rPr>
+          <w:sz w:val="52"/>
+          <w:szCs w:val="52"/>
+        </w:rPr>
+      </w:pPr>
+      <w:r>
+        <w:rPr>
+          <w:sz w:val="52"/>
+          <w:szCs w:val="52"/>
+        </w:rPr>
+        <w:t>Need to add StaticBody2D nodes w/ corresponding CollisionShape2D.</w:t>
       </w:r>
     </w:p>
     <w:p>
@@ -1020,7 +2413,14 @@
           <w:sz w:val="52"/>
           <w:szCs w:val="52"/>
         </w:rPr>
-        <w:t>should assign A,B,C, or D to correct_answer</w:t>
+        <w:t xml:space="preserve">Stop player from walking </w:t>
+      </w:r>
+      <w:r>
+        <w:rPr>
+          <w:sz w:val="52"/>
+          <w:szCs w:val="52"/>
+        </w:rPr>
+        <w:t>through home walls</w:t>
       </w:r>
     </w:p>
     <w:p>
@@ -1040,7 +2440,97 @@
           <w:sz w:val="52"/>
           <w:szCs w:val="52"/>
         </w:rPr>
-        <w:t>answer_picked(String)</w:t>
+        <w:lastRenderedPageBreak/>
+        <w:t xml:space="preserve">Create </w:t>
+      </w:r>
+      <w:r>
+        <w:rPr>
+          <w:sz w:val="52"/>
+          <w:szCs w:val="52"/>
+        </w:rPr>
+        <w:t xml:space="preserve">attached script </w:t>
+      </w:r>
+      <w:r>
+        <w:rPr>
+          <w:sz w:val="52"/>
+          <w:szCs w:val="52"/>
+        </w:rPr>
+        <w:t xml:space="preserve">that emits a signal when a CharacterBody2D enters </w:t>
+      </w:r>
+      <w:proofErr w:type="spellStart"/>
+      <w:r>
+        <w:rPr>
+          <w:sz w:val="52"/>
+          <w:szCs w:val="52"/>
+        </w:rPr>
+        <w:t>door_to_</w:t>
+      </w:r>
+      <w:r>
+        <w:rPr>
+          <w:sz w:val="52"/>
+          <w:szCs w:val="52"/>
+        </w:rPr>
+        <w:t>farm</w:t>
+      </w:r>
+      <w:proofErr w:type="spellEnd"/>
+      <w:r>
+        <w:rPr>
+          <w:sz w:val="52"/>
+          <w:szCs w:val="52"/>
+        </w:rPr>
+        <w:t>.</w:t>
+      </w:r>
+    </w:p>
+    <w:p>
+      <w:pPr>
+        <w:rPr>
+          <w:sz w:val="52"/>
+          <w:szCs w:val="52"/>
+        </w:rPr>
+      </w:pPr>
+    </w:p>
+    <w:p>
+      <w:pPr>
+        <w:pStyle w:val="ListParagraph"/>
+        <w:numPr>
+          <w:ilvl w:val="0"/>
+          <w:numId w:val="2"/>
+        </w:numPr>
+        <w:rPr>
+          <w:color w:val="E97132" w:themeColor="accent2"/>
+          <w:sz w:val="52"/>
+          <w:szCs w:val="52"/>
+        </w:rPr>
+      </w:pPr>
+      <w:r>
+        <w:rPr>
+          <w:color w:val="E97132" w:themeColor="accent2"/>
+          <w:sz w:val="52"/>
+          <w:szCs w:val="52"/>
+        </w:rPr>
+        <w:t>Create a Main Menu scene</w:t>
+      </w:r>
+    </w:p>
+    <w:p>
+      <w:pPr>
+        <w:pStyle w:val="ListParagraph"/>
+        <w:numPr>
+          <w:ilvl w:val="1"/>
+          <w:numId w:val="2"/>
+        </w:numPr>
+        <w:rPr>
+          <w:color w:val="E97132" w:themeColor="accent2"/>
+          <w:sz w:val="52"/>
+          <w:szCs w:val="52"/>
+        </w:rPr>
+      </w:pPr>
+      <w:r>
+        <w:rPr>
+          <w:color w:val="E97132" w:themeColor="accent2"/>
+          <w:sz w:val="52"/>
+          <w:szCs w:val="52"/>
+        </w:rPr>
+        <w:t>should contain the follow buttons</w:t>
       </w:r>
     </w:p>
     <w:p>
@@ -1051,16 +2541,62 @@
           <w:numId w:val="2"/>
         </w:numPr>
         <w:rPr>
-          <w:sz w:val="52"/>
-          <w:szCs w:val="52"/>
-        </w:rPr>
-      </w:pPr>
-      <w:r>
-        <w:rPr>
-          <w:sz w:val="52"/>
-          <w:szCs w:val="52"/>
-        </w:rPr>
-        <w:t>needs to compare selected _answer to correct_answer and increment.</w:t>
+          <w:color w:val="E97132" w:themeColor="accent2"/>
+          <w:sz w:val="52"/>
+          <w:szCs w:val="52"/>
+        </w:rPr>
+      </w:pPr>
+      <w:r>
+        <w:rPr>
+          <w:color w:val="E97132" w:themeColor="accent2"/>
+          <w:sz w:val="52"/>
+          <w:szCs w:val="52"/>
+        </w:rPr>
+        <w:t>Start New Game</w:t>
+      </w:r>
+    </w:p>
+    <w:p>
+      <w:pPr>
+        <w:pStyle w:val="ListParagraph"/>
+        <w:numPr>
+          <w:ilvl w:val="2"/>
+          <w:numId w:val="2"/>
+        </w:numPr>
+        <w:rPr>
+          <w:color w:val="E97132" w:themeColor="accent2"/>
+          <w:sz w:val="52"/>
+          <w:szCs w:val="52"/>
+        </w:rPr>
+      </w:pPr>
+      <w:r>
+        <w:rPr>
+          <w:color w:val="E97132" w:themeColor="accent2"/>
+          <w:sz w:val="52"/>
+          <w:szCs w:val="52"/>
+        </w:rPr>
+        <w:t>Load Save</w:t>
+      </w:r>
+    </w:p>
+    <w:p>
+      <w:pPr>
+        <w:pStyle w:val="ListParagraph"/>
+        <w:numPr>
+          <w:ilvl w:val="2"/>
+          <w:numId w:val="2"/>
+        </w:numPr>
+        <w:rPr>
+          <w:color w:val="E97132" w:themeColor="accent2"/>
+          <w:sz w:val="52"/>
+          <w:szCs w:val="52"/>
+        </w:rPr>
+      </w:pPr>
+      <w:r>
+        <w:rPr>
+          <w:color w:val="E97132" w:themeColor="accent2"/>
+          <w:sz w:val="52"/>
+          <w:szCs w:val="52"/>
+        </w:rPr>
+        <w:t>Quit</w:t>
       </w:r>
     </w:p>
     <w:p>
@@ -1071,16 +2607,34 @@
           <w:numId w:val="2"/>
         </w:numPr>
         <w:rPr>
-          <w:sz w:val="52"/>
-          <w:szCs w:val="52"/>
-        </w:rPr>
-      </w:pPr>
-      <w:r>
-        <w:rPr>
-          <w:sz w:val="52"/>
-          <w:szCs w:val="52"/>
-        </w:rPr>
-        <w:t>Start_quiz(Array[ASLQuestion])</w:t>
+          <w:color w:val="E97132" w:themeColor="accent2"/>
+          <w:sz w:val="52"/>
+          <w:szCs w:val="52"/>
+        </w:rPr>
+      </w:pPr>
+      <w:r>
+        <w:rPr>
+          <w:color w:val="E97132" w:themeColor="accent2"/>
+          <w:sz w:val="52"/>
+          <w:szCs w:val="52"/>
+        </w:rPr>
+        <w:t xml:space="preserve">For </w:t>
+      </w:r>
+      <w:r>
+        <w:rPr>
+          <w:color w:val="E97132" w:themeColor="accent2"/>
+          <w:sz w:val="52"/>
+          <w:szCs w:val="52"/>
+        </w:rPr>
+        <w:t>load save and start new game</w:t>
+      </w:r>
+      <w:r>
+        <w:rPr>
+          <w:color w:val="E97132" w:themeColor="accent2"/>
+          <w:sz w:val="52"/>
+          <w:szCs w:val="52"/>
+        </w:rPr>
+        <w:t>:</w:t>
       </w:r>
     </w:p>
     <w:p>
@@ -1091,16 +2645,18 @@
           <w:numId w:val="2"/>
         </w:numPr>
         <w:rPr>
-          <w:sz w:val="52"/>
-          <w:szCs w:val="52"/>
-        </w:rPr>
-      </w:pPr>
-      <w:r>
-        <w:rPr>
-          <w:sz w:val="52"/>
-          <w:szCs w:val="52"/>
-        </w:rPr>
-        <w:t>Should randomize the type of question displayed</w:t>
+          <w:color w:val="E97132" w:themeColor="accent2"/>
+          <w:sz w:val="52"/>
+          <w:szCs w:val="52"/>
+        </w:rPr>
+      </w:pPr>
+      <w:r>
+        <w:rPr>
+          <w:color w:val="E97132" w:themeColor="accent2"/>
+          <w:sz w:val="52"/>
+          <w:szCs w:val="52"/>
+        </w:rPr>
+        <w:t>Create signal in signal hub</w:t>
       </w:r>
     </w:p>
     <w:p>
@@ -1111,138 +2667,81 @@
           <w:numId w:val="2"/>
         </w:numPr>
         <w:rPr>
-          <w:sz w:val="52"/>
-          <w:szCs w:val="52"/>
-        </w:rPr>
-      </w:pPr>
-      <w:r>
-        <w:rPr>
-          <w:sz w:val="52"/>
-          <w:szCs w:val="52"/>
-        </w:rPr>
-        <w:t xml:space="preserve">Should pause cycling through the array of questions until </w:t>
-      </w:r>
-      <w:r>
-        <w:rPr>
+          <w:color w:val="E97132" w:themeColor="accent2"/>
+          <w:sz w:val="52"/>
+          <w:szCs w:val="52"/>
+        </w:rPr>
+      </w:pPr>
+      <w:r>
+        <w:rPr>
+          <w:color w:val="E97132" w:themeColor="accent2"/>
+          <w:sz w:val="52"/>
+          <w:szCs w:val="52"/>
+        </w:rPr>
+        <w:t xml:space="preserve">Create function in </w:t>
+      </w:r>
+      <w:proofErr w:type="spellStart"/>
+      <w:r>
+        <w:rPr>
+          <w:color w:val="E97132" w:themeColor="accent2"/>
+          <w:sz w:val="52"/>
+          <w:szCs w:val="52"/>
+        </w:rPr>
+        <w:t>scene_transitioner</w:t>
+      </w:r>
+      <w:proofErr w:type="spellEnd"/>
+      <w:r>
+        <w:rPr>
+          <w:color w:val="E97132" w:themeColor="accent2"/>
+          <w:sz w:val="52"/>
+          <w:szCs w:val="52"/>
+        </w:rPr>
+        <w:t xml:space="preserve"> and connect it to the signal to transition to the proper scene</w:t>
+      </w:r>
+    </w:p>
+    <w:p>
+      <w:pPr>
+        <w:pStyle w:val="ListParagraph"/>
+        <w:numPr>
+          <w:ilvl w:val="1"/>
+          <w:numId w:val="2"/>
+        </w:numPr>
+        <w:rPr>
+          <w:color w:val="E97132" w:themeColor="accent2"/>
+          <w:sz w:val="52"/>
+          <w:szCs w:val="52"/>
+        </w:rPr>
+      </w:pPr>
+      <w:r>
+        <w:rPr>
+          <w:color w:val="E97132" w:themeColor="accent2"/>
+          <w:sz w:val="52"/>
+          <w:szCs w:val="52"/>
+        </w:rPr>
+        <w:t>Quit button should exit the game</w:t>
+      </w:r>
+    </w:p>
+    <w:p>
+      <w:pPr>
+        <w:pStyle w:val="ListParagraph"/>
+        <w:numPr>
+          <w:ilvl w:val="1"/>
+          <w:numId w:val="2"/>
+        </w:numPr>
+        <w:rPr>
+          <w:color w:val="E97132" w:themeColor="accent2"/>
+          <w:sz w:val="52"/>
+          <w:szCs w:val="52"/>
+        </w:rPr>
+      </w:pPr>
+      <w:r>
+        <w:rPr>
+          <w:color w:val="E97132" w:themeColor="accent2"/>
           <w:sz w:val="52"/>
           <w:szCs w:val="52"/>
         </w:rPr>
         <w:lastRenderedPageBreak/>
-        <w:t>player selects an answer to each question</w:t>
-      </w:r>
-    </w:p>
-    <w:p>
-      <w:pPr>
-        <w:pStyle w:val="ListParagraph"/>
-        <w:numPr>
-          <w:ilvl w:val="2"/>
-          <w:numId w:val="2"/>
-        </w:numPr>
-        <w:rPr>
-          <w:sz w:val="52"/>
-          <w:szCs w:val="52"/>
-        </w:rPr>
-      </w:pPr>
-      <w:r>
-        <w:rPr>
-          <w:sz w:val="52"/>
-          <w:szCs w:val="52"/>
-        </w:rPr>
-        <w:t>Should run quiz_finished()</w:t>
-      </w:r>
-    </w:p>
-    <w:p>
-      <w:pPr>
-        <w:pStyle w:val="ListParagraph"/>
-        <w:numPr>
-          <w:ilvl w:val="1"/>
-          <w:numId w:val="2"/>
-        </w:numPr>
-        <w:rPr>
-          <w:sz w:val="52"/>
-          <w:szCs w:val="52"/>
-        </w:rPr>
-      </w:pPr>
-      <w:r>
-        <w:rPr>
-          <w:sz w:val="52"/>
-          <w:szCs w:val="52"/>
-        </w:rPr>
-        <w:t>quiz_finished()</w:t>
-      </w:r>
-    </w:p>
-    <w:p>
-      <w:pPr>
-        <w:pStyle w:val="ListParagraph"/>
-        <w:numPr>
-          <w:ilvl w:val="2"/>
-          <w:numId w:val="2"/>
-        </w:numPr>
-        <w:rPr>
-          <w:sz w:val="52"/>
-          <w:szCs w:val="52"/>
-        </w:rPr>
-      </w:pPr>
-      <w:r>
-        <w:rPr>
-          <w:sz w:val="52"/>
-          <w:szCs w:val="52"/>
-        </w:rPr>
-        <w:t xml:space="preserve">Should emit a signal </w:t>
-      </w:r>
-      <w:r>
-        <w:rPr>
-          <w:sz w:val="52"/>
-          <w:szCs w:val="52"/>
-        </w:rPr>
-        <w:t>with</w:t>
-      </w:r>
-      <w:r>
-        <w:rPr>
-          <w:sz w:val="52"/>
-          <w:szCs w:val="52"/>
-        </w:rPr>
-        <w:t xml:space="preserve"> answered_correclty through signal hub .</w:t>
-      </w:r>
-    </w:p>
-    <w:p>
-      <w:pPr>
-        <w:pStyle w:val="ListParagraph"/>
-        <w:numPr>
-          <w:ilvl w:val="3"/>
-          <w:numId w:val="2"/>
-        </w:numPr>
-        <w:rPr>
-          <w:sz w:val="52"/>
-          <w:szCs w:val="52"/>
-        </w:rPr>
-      </w:pPr>
-      <w:r>
-        <w:rPr>
-          <w:sz w:val="52"/>
-          <w:szCs w:val="52"/>
-        </w:rPr>
-        <w:t>Need to create signal in signal hub first that holds an int.</w:t>
-      </w:r>
-    </w:p>
-    <w:p>
-      <w:pPr>
-        <w:pStyle w:val="ListParagraph"/>
-        <w:numPr>
-          <w:ilvl w:val="2"/>
-          <w:numId w:val="2"/>
-        </w:numPr>
-        <w:rPr>
-          <w:sz w:val="52"/>
-          <w:szCs w:val="52"/>
-        </w:rPr>
-      </w:pPr>
-      <w:r>
-        <w:rPr>
-          <w:sz w:val="52"/>
-          <w:szCs w:val="52"/>
-        </w:rPr>
-        <w:t>Should hide all containers</w:t>
+        <w:t>Scene should contain a label with the games Title.</w:t>
       </w:r>
     </w:p>
     <w:p>
@@ -1253,641 +2752,36 @@
           <w:numId w:val="2"/>
         </w:numPr>
         <w:rPr>
-          <w:sz w:val="52"/>
-          <w:szCs w:val="52"/>
-        </w:rPr>
-      </w:pPr>
-      <w:r>
-        <w:rPr>
-          <w:sz w:val="52"/>
-          <w:szCs w:val="52"/>
-        </w:rPr>
-        <w:t>Farm Scene</w:t>
-      </w:r>
-    </w:p>
-    <w:p>
-      <w:pPr>
-        <w:pStyle w:val="ListParagraph"/>
-        <w:numPr>
-          <w:ilvl w:val="1"/>
-          <w:numId w:val="2"/>
-        </w:numPr>
-        <w:rPr>
-          <w:sz w:val="52"/>
-          <w:szCs w:val="52"/>
-        </w:rPr>
-      </w:pPr>
-      <w:r>
-        <w:rPr>
-          <w:sz w:val="52"/>
-          <w:szCs w:val="52"/>
-        </w:rPr>
-        <w:t>Need to instantiate 3 Tree’s, assign difficulty levels, 3 levels of growth, and name (TREE1,TREE2,TREE3)</w:t>
-      </w:r>
-    </w:p>
-    <w:p>
-      <w:pPr>
-        <w:pStyle w:val="ListParagraph"/>
-        <w:numPr>
-          <w:ilvl w:val="1"/>
-          <w:numId w:val="2"/>
-        </w:numPr>
-        <w:rPr>
-          <w:sz w:val="52"/>
-          <w:szCs w:val="52"/>
-        </w:rPr>
-      </w:pPr>
-      <w:r>
-        <w:rPr>
-          <w:sz w:val="52"/>
-          <w:szCs w:val="52"/>
-        </w:rPr>
-        <w:t>Need to get scene background</w:t>
-      </w:r>
-    </w:p>
-    <w:p>
-      <w:pPr>
-        <w:pStyle w:val="ListParagraph"/>
-        <w:numPr>
-          <w:ilvl w:val="2"/>
-          <w:numId w:val="2"/>
-        </w:numPr>
-        <w:rPr>
-          <w:sz w:val="52"/>
-          <w:szCs w:val="52"/>
-        </w:rPr>
-      </w:pPr>
-      <w:r>
-        <w:rPr>
-          <w:sz w:val="52"/>
-          <w:szCs w:val="52"/>
-        </w:rPr>
-        <w:lastRenderedPageBreak/>
-        <w:t>Should have a farm area and a home area</w:t>
-      </w:r>
-    </w:p>
-    <w:p>
-      <w:pPr>
-        <w:pStyle w:val="ListParagraph"/>
-        <w:numPr>
-          <w:ilvl w:val="1"/>
-          <w:numId w:val="2"/>
-        </w:numPr>
-        <w:rPr>
-          <w:sz w:val="52"/>
-          <w:szCs w:val="52"/>
-        </w:rPr>
-      </w:pPr>
-      <w:r>
-        <w:rPr>
-          <w:sz w:val="52"/>
-          <w:szCs w:val="52"/>
-        </w:rPr>
-        <w:t xml:space="preserve">Need to add area2D node to scene w/ corresponding </w:t>
-      </w:r>
-      <w:r>
-        <w:rPr>
-          <w:sz w:val="52"/>
-          <w:szCs w:val="52"/>
-        </w:rPr>
-        <w:t xml:space="preserve">CollisionShape2d </w:t>
-      </w:r>
-      <w:r>
-        <w:rPr>
-          <w:sz w:val="52"/>
-          <w:szCs w:val="52"/>
-        </w:rPr>
-        <w:t>called door_to_home.</w:t>
-      </w:r>
-    </w:p>
-    <w:p>
-      <w:pPr>
-        <w:pStyle w:val="ListParagraph"/>
-        <w:numPr>
-          <w:ilvl w:val="1"/>
-          <w:numId w:val="2"/>
-        </w:numPr>
-        <w:rPr>
-          <w:sz w:val="52"/>
-          <w:szCs w:val="52"/>
-        </w:rPr>
-      </w:pPr>
-      <w:r>
-        <w:rPr>
-          <w:sz w:val="52"/>
-          <w:szCs w:val="52"/>
-        </w:rPr>
-        <w:t>Need to add StaticBody2D nodes w/ corresponding CollisionShape2D.</w:t>
-      </w:r>
-    </w:p>
-    <w:p>
-      <w:pPr>
-        <w:pStyle w:val="ListParagraph"/>
-        <w:numPr>
-          <w:ilvl w:val="2"/>
-          <w:numId w:val="2"/>
-        </w:numPr>
-        <w:rPr>
-          <w:sz w:val="52"/>
-          <w:szCs w:val="52"/>
-        </w:rPr>
-      </w:pPr>
-      <w:r>
-        <w:rPr>
-          <w:sz w:val="52"/>
-          <w:szCs w:val="52"/>
-        </w:rPr>
-        <w:t>Stop player from walking on top of home.</w:t>
-      </w:r>
-    </w:p>
-    <w:p>
-      <w:pPr>
-        <w:pStyle w:val="ListParagraph"/>
-        <w:numPr>
-          <w:ilvl w:val="2"/>
-          <w:numId w:val="2"/>
-        </w:numPr>
-        <w:rPr>
-          <w:sz w:val="52"/>
-          <w:szCs w:val="52"/>
-        </w:rPr>
-      </w:pPr>
-      <w:r>
-        <w:rPr>
-          <w:sz w:val="52"/>
-          <w:szCs w:val="52"/>
-        </w:rPr>
-        <w:t>Set world boundaries to stop player from walking out of the map.</w:t>
-      </w:r>
-    </w:p>
-    <w:p>
-      <w:pPr>
-        <w:pStyle w:val="ListParagraph"/>
-        <w:numPr>
-          <w:ilvl w:val="1"/>
-          <w:numId w:val="2"/>
-        </w:numPr>
-        <w:rPr>
-          <w:sz w:val="52"/>
-          <w:szCs w:val="52"/>
-        </w:rPr>
-      </w:pPr>
-      <w:r>
-        <w:rPr>
-          <w:sz w:val="52"/>
-          <w:szCs w:val="52"/>
-        </w:rPr>
-        <w:t>Create script that emits a signal when a CharacterBody2D enters door_to_home.</w:t>
-      </w:r>
-    </w:p>
-    <w:p>
-      <w:pPr>
-        <w:pStyle w:val="ListParagraph"/>
-        <w:numPr>
-          <w:ilvl w:val="0"/>
-          <w:numId w:val="2"/>
-        </w:numPr>
-        <w:rPr>
-          <w:sz w:val="52"/>
-          <w:szCs w:val="52"/>
-        </w:rPr>
-      </w:pPr>
-      <w:r>
-        <w:rPr>
-          <w:sz w:val="52"/>
-          <w:szCs w:val="52"/>
-        </w:rPr>
-        <w:lastRenderedPageBreak/>
-        <w:t>Home scene</w:t>
-      </w:r>
-    </w:p>
-    <w:p>
-      <w:pPr>
-        <w:pStyle w:val="ListParagraph"/>
-        <w:numPr>
-          <w:ilvl w:val="1"/>
-          <w:numId w:val="2"/>
-        </w:numPr>
-        <w:rPr>
-          <w:sz w:val="52"/>
-          <w:szCs w:val="52"/>
-        </w:rPr>
-      </w:pPr>
-      <w:r>
-        <w:rPr>
-          <w:sz w:val="52"/>
-          <w:szCs w:val="52"/>
-        </w:rPr>
-        <w:t xml:space="preserve">Need to instantiate </w:t>
-      </w:r>
-      <w:r>
-        <w:rPr>
-          <w:sz w:val="52"/>
-          <w:szCs w:val="52"/>
-        </w:rPr>
-        <w:t>Newspaper and Bed</w:t>
-      </w:r>
-    </w:p>
-    <w:p>
-      <w:pPr>
-        <w:pStyle w:val="ListParagraph"/>
-        <w:numPr>
-          <w:ilvl w:val="1"/>
-          <w:numId w:val="2"/>
-        </w:numPr>
-        <w:rPr>
-          <w:sz w:val="52"/>
-          <w:szCs w:val="52"/>
-        </w:rPr>
-      </w:pPr>
-      <w:r>
-        <w:rPr>
-          <w:sz w:val="52"/>
-          <w:szCs w:val="52"/>
-        </w:rPr>
-        <w:t>Need to get scene background</w:t>
-      </w:r>
-    </w:p>
-    <w:p>
-      <w:pPr>
-        <w:pStyle w:val="ListParagraph"/>
-        <w:numPr>
-          <w:ilvl w:val="1"/>
-          <w:numId w:val="2"/>
-        </w:numPr>
-        <w:rPr>
-          <w:sz w:val="52"/>
-          <w:szCs w:val="52"/>
-        </w:rPr>
-      </w:pPr>
-      <w:r>
-        <w:rPr>
-          <w:sz w:val="52"/>
-          <w:szCs w:val="52"/>
-        </w:rPr>
-        <w:t>Need to add area2D node to scene w/ corresponding CollisionShape2d called door_to</w:t>
-      </w:r>
-      <w:r>
-        <w:rPr>
-          <w:sz w:val="52"/>
-          <w:szCs w:val="52"/>
-        </w:rPr>
-        <w:t>_farm,</w:t>
-      </w:r>
-    </w:p>
-    <w:p>
-      <w:pPr>
-        <w:pStyle w:val="ListParagraph"/>
-        <w:numPr>
-          <w:ilvl w:val="1"/>
-          <w:numId w:val="2"/>
-        </w:numPr>
-        <w:rPr>
-          <w:sz w:val="52"/>
-          <w:szCs w:val="52"/>
-        </w:rPr>
-      </w:pPr>
-      <w:r>
-        <w:rPr>
-          <w:sz w:val="52"/>
-          <w:szCs w:val="52"/>
-        </w:rPr>
-        <w:t>Need to add StaticBody2D nodes w/ corresponding CollisionShape2D.</w:t>
-      </w:r>
-    </w:p>
-    <w:p>
-      <w:pPr>
-        <w:pStyle w:val="ListParagraph"/>
-        <w:numPr>
-          <w:ilvl w:val="2"/>
-          <w:numId w:val="2"/>
-        </w:numPr>
-        <w:rPr>
-          <w:sz w:val="52"/>
-          <w:szCs w:val="52"/>
-        </w:rPr>
-      </w:pPr>
-      <w:r>
-        <w:rPr>
-          <w:sz w:val="52"/>
-          <w:szCs w:val="52"/>
-        </w:rPr>
-        <w:t xml:space="preserve">Stop player from walking </w:t>
-      </w:r>
-      <w:r>
-        <w:rPr>
-          <w:sz w:val="52"/>
-          <w:szCs w:val="52"/>
-        </w:rPr>
-        <w:t>through home walls</w:t>
-      </w:r>
-    </w:p>
-    <w:p>
-      <w:pPr>
-        <w:pStyle w:val="ListParagraph"/>
-        <w:numPr>
-          <w:ilvl w:val="1"/>
-          <w:numId w:val="2"/>
-        </w:numPr>
-        <w:rPr>
-          <w:sz w:val="52"/>
-          <w:szCs w:val="52"/>
-        </w:rPr>
-      </w:pPr>
-      <w:r>
-        <w:rPr>
-          <w:sz w:val="52"/>
-          <w:szCs w:val="52"/>
-        </w:rPr>
-        <w:t xml:space="preserve">Create </w:t>
-      </w:r>
-      <w:r>
-        <w:rPr>
-          <w:sz w:val="52"/>
-          <w:szCs w:val="52"/>
-        </w:rPr>
-        <w:t xml:space="preserve">attached script </w:t>
-      </w:r>
-      <w:r>
-        <w:rPr>
-          <w:sz w:val="52"/>
-          <w:szCs w:val="52"/>
-        </w:rPr>
-        <w:t>that emits a signal when a CharacterBody2D enters door_to_</w:t>
-      </w:r>
-      <w:r>
-        <w:rPr>
-          <w:sz w:val="52"/>
-          <w:szCs w:val="52"/>
-        </w:rPr>
-        <w:t>farm.</w:t>
-      </w:r>
-    </w:p>
-    <w:p>
-      <w:pPr>
-        <w:rPr>
-          <w:sz w:val="52"/>
-          <w:szCs w:val="52"/>
-        </w:rPr>
-      </w:pPr>
-    </w:p>
-    <w:p>
-      <w:pPr>
-        <w:pStyle w:val="ListParagraph"/>
-        <w:numPr>
-          <w:ilvl w:val="0"/>
-          <w:numId w:val="2"/>
-        </w:numPr>
-        <w:rPr>
-          <w:color w:val="E97132" w:themeColor="accent2"/>
-          <w:sz w:val="52"/>
-          <w:szCs w:val="52"/>
-        </w:rPr>
-      </w:pPr>
-      <w:r>
-        <w:rPr>
-          <w:color w:val="E97132" w:themeColor="accent2"/>
-          <w:sz w:val="52"/>
-          <w:szCs w:val="52"/>
-        </w:rPr>
-        <w:lastRenderedPageBreak/>
-        <w:t>Create a Main Menu scene</w:t>
-      </w:r>
-    </w:p>
-    <w:p>
-      <w:pPr>
-        <w:pStyle w:val="ListParagraph"/>
-        <w:numPr>
-          <w:ilvl w:val="1"/>
-          <w:numId w:val="2"/>
-        </w:numPr>
-        <w:rPr>
-          <w:color w:val="E97132" w:themeColor="accent2"/>
-          <w:sz w:val="52"/>
-          <w:szCs w:val="52"/>
-        </w:rPr>
-      </w:pPr>
-      <w:r>
-        <w:rPr>
-          <w:color w:val="E97132" w:themeColor="accent2"/>
-          <w:sz w:val="52"/>
-          <w:szCs w:val="52"/>
-        </w:rPr>
-        <w:t>should contain the follow buttons</w:t>
-      </w:r>
-    </w:p>
-    <w:p>
-      <w:pPr>
-        <w:pStyle w:val="ListParagraph"/>
-        <w:numPr>
-          <w:ilvl w:val="2"/>
-          <w:numId w:val="2"/>
-        </w:numPr>
-        <w:rPr>
-          <w:color w:val="E97132" w:themeColor="accent2"/>
-          <w:sz w:val="52"/>
-          <w:szCs w:val="52"/>
-        </w:rPr>
-      </w:pPr>
-      <w:r>
-        <w:rPr>
-          <w:color w:val="E97132" w:themeColor="accent2"/>
-          <w:sz w:val="52"/>
-          <w:szCs w:val="52"/>
-        </w:rPr>
-        <w:t>Start New Game</w:t>
-      </w:r>
-    </w:p>
-    <w:p>
-      <w:pPr>
-        <w:pStyle w:val="ListParagraph"/>
-        <w:numPr>
-          <w:ilvl w:val="2"/>
-          <w:numId w:val="2"/>
-        </w:numPr>
-        <w:rPr>
-          <w:color w:val="E97132" w:themeColor="accent2"/>
-          <w:sz w:val="52"/>
-          <w:szCs w:val="52"/>
-        </w:rPr>
-      </w:pPr>
-      <w:r>
-        <w:rPr>
-          <w:color w:val="E97132" w:themeColor="accent2"/>
-          <w:sz w:val="52"/>
-          <w:szCs w:val="52"/>
-        </w:rPr>
-        <w:t>Load Save</w:t>
-      </w:r>
-    </w:p>
-    <w:p>
-      <w:pPr>
-        <w:pStyle w:val="ListParagraph"/>
-        <w:numPr>
-          <w:ilvl w:val="2"/>
-          <w:numId w:val="2"/>
-        </w:numPr>
-        <w:rPr>
-          <w:color w:val="E97132" w:themeColor="accent2"/>
-          <w:sz w:val="52"/>
-          <w:szCs w:val="52"/>
-        </w:rPr>
-      </w:pPr>
-      <w:r>
-        <w:rPr>
-          <w:color w:val="E97132" w:themeColor="accent2"/>
-          <w:sz w:val="52"/>
-          <w:szCs w:val="52"/>
-        </w:rPr>
-        <w:t>Quit</w:t>
-      </w:r>
-    </w:p>
-    <w:p>
-      <w:pPr>
-        <w:pStyle w:val="ListParagraph"/>
-        <w:numPr>
-          <w:ilvl w:val="1"/>
-          <w:numId w:val="2"/>
-        </w:numPr>
-        <w:rPr>
-          <w:color w:val="E97132" w:themeColor="accent2"/>
-          <w:sz w:val="52"/>
-          <w:szCs w:val="52"/>
-        </w:rPr>
-      </w:pPr>
-      <w:r>
-        <w:rPr>
-          <w:color w:val="E97132" w:themeColor="accent2"/>
-          <w:sz w:val="52"/>
-          <w:szCs w:val="52"/>
-        </w:rPr>
-        <w:t xml:space="preserve">For </w:t>
-      </w:r>
-      <w:r>
-        <w:rPr>
-          <w:color w:val="E97132" w:themeColor="accent2"/>
-          <w:sz w:val="52"/>
-          <w:szCs w:val="52"/>
-        </w:rPr>
-        <w:t>load save and start new game</w:t>
-      </w:r>
-      <w:r>
-        <w:rPr>
-          <w:color w:val="E97132" w:themeColor="accent2"/>
-          <w:sz w:val="52"/>
-          <w:szCs w:val="52"/>
-        </w:rPr>
-        <w:t>:</w:t>
-      </w:r>
-    </w:p>
-    <w:p>
-      <w:pPr>
-        <w:pStyle w:val="ListParagraph"/>
-        <w:numPr>
-          <w:ilvl w:val="2"/>
-          <w:numId w:val="2"/>
-        </w:numPr>
-        <w:rPr>
-          <w:color w:val="E97132" w:themeColor="accent2"/>
-          <w:sz w:val="52"/>
-          <w:szCs w:val="52"/>
-        </w:rPr>
-      </w:pPr>
-      <w:r>
-        <w:rPr>
-          <w:color w:val="E97132" w:themeColor="accent2"/>
-          <w:sz w:val="52"/>
-          <w:szCs w:val="52"/>
-        </w:rPr>
-        <w:t>Create signal in signal hub</w:t>
-      </w:r>
-    </w:p>
-    <w:p>
-      <w:pPr>
-        <w:pStyle w:val="ListParagraph"/>
-        <w:numPr>
-          <w:ilvl w:val="2"/>
-          <w:numId w:val="2"/>
-        </w:numPr>
-        <w:rPr>
-          <w:color w:val="E97132" w:themeColor="accent2"/>
-          <w:sz w:val="52"/>
-          <w:szCs w:val="52"/>
-        </w:rPr>
-      </w:pPr>
-      <w:r>
-        <w:rPr>
-          <w:color w:val="E97132" w:themeColor="accent2"/>
-          <w:sz w:val="52"/>
-          <w:szCs w:val="52"/>
-        </w:rPr>
-        <w:t>Create function in scene_transitioner and connect it to the signal to transition to the proper scene</w:t>
-      </w:r>
-    </w:p>
-    <w:p>
-      <w:pPr>
-        <w:pStyle w:val="ListParagraph"/>
-        <w:numPr>
-          <w:ilvl w:val="1"/>
-          <w:numId w:val="2"/>
-        </w:numPr>
-        <w:rPr>
-          <w:color w:val="E97132" w:themeColor="accent2"/>
-          <w:sz w:val="52"/>
-          <w:szCs w:val="52"/>
-        </w:rPr>
-      </w:pPr>
-      <w:r>
-        <w:rPr>
-          <w:color w:val="E97132" w:themeColor="accent2"/>
-          <w:sz w:val="52"/>
-          <w:szCs w:val="52"/>
-        </w:rPr>
-        <w:t>Quit button should exit the game</w:t>
-      </w:r>
-    </w:p>
-    <w:p>
-      <w:pPr>
-        <w:pStyle w:val="ListParagraph"/>
-        <w:numPr>
-          <w:ilvl w:val="1"/>
-          <w:numId w:val="2"/>
-        </w:numPr>
-        <w:rPr>
-          <w:color w:val="E97132" w:themeColor="accent2"/>
-          <w:sz w:val="52"/>
-          <w:szCs w:val="52"/>
-        </w:rPr>
-      </w:pPr>
-      <w:r>
-        <w:rPr>
-          <w:color w:val="E97132" w:themeColor="accent2"/>
-          <w:sz w:val="52"/>
-          <w:szCs w:val="52"/>
-        </w:rPr>
-        <w:t>Scene should contain a label with the games Title.</w:t>
-      </w:r>
-    </w:p>
-    <w:p>
-      <w:pPr>
-        <w:pStyle w:val="ListParagraph"/>
-        <w:numPr>
-          <w:ilvl w:val="0"/>
-          <w:numId w:val="2"/>
-        </w:numPr>
-        <w:rPr>
-          <w:color w:val="E97132" w:themeColor="accent2"/>
-          <w:sz w:val="52"/>
-          <w:szCs w:val="52"/>
-        </w:rPr>
-      </w:pPr>
-      <w:r>
-        <w:rPr>
-          <w:color w:val="E97132" w:themeColor="accent2"/>
-          <w:sz w:val="52"/>
-          <w:szCs w:val="52"/>
-        </w:rPr>
-        <w:t>We would need to have the main title screen instantiate a game_manager scene with every new game.</w:t>
+          <w:color w:val="E97132" w:themeColor="accent2"/>
+          <w:sz w:val="52"/>
+          <w:szCs w:val="52"/>
+        </w:rPr>
+      </w:pPr>
+      <w:r>
+        <w:rPr>
+          <w:color w:val="E97132" w:themeColor="accent2"/>
+          <w:sz w:val="52"/>
+          <w:szCs w:val="52"/>
+        </w:rPr>
+        <w:t xml:space="preserve">We would need to have the main title screen instantiate a </w:t>
+      </w:r>
+      <w:proofErr w:type="spellStart"/>
+      <w:r>
+        <w:rPr>
+          <w:color w:val="E97132" w:themeColor="accent2"/>
+          <w:sz w:val="52"/>
+          <w:szCs w:val="52"/>
+        </w:rPr>
+        <w:t>game_manager</w:t>
+      </w:r>
+      <w:proofErr w:type="spellEnd"/>
+      <w:r>
+        <w:rPr>
+          <w:color w:val="E97132" w:themeColor="accent2"/>
+          <w:sz w:val="52"/>
+          <w:szCs w:val="52"/>
+        </w:rPr>
+        <w:t xml:space="preserve"> scene with every new game.</w:t>
       </w:r>
     </w:p>
     <w:sectPr>

</xml_diff>

<commit_message>
ASL_Quiz_UI and Task update
Adjusted:
start_quiz - clears reusable variables, calls next_question() and increments quiz index.

make_IP_question -  now displays correct images and 4 meanings. Assigns the correct meaning to the correct_answer.

make_MP_question - now displays correct meaning and 4 images. Assigns the correct image to the corresponding correct_answer .

randomized_question_type - now randomly picks between IP or MP question.

randomized_correct_answer - randomly assigns correct answer as A,B,C, or D.

**Fixed scene buttons, as the signals were not linked to the functions.

**Added _Ready() to help w/ testing and future testing.

Added:
next_question()  - shows next question in array.

quiz_questions - stores array of  questions passed to ASL_Quiz_UI

quiz_index - stores the current index of the question array.
</commit_message>
<xml_diff>
--- a/Week 4/Tasks.docx
+++ b/Week 4/Tasks.docx
@@ -63,14 +63,7 @@
           <w:sz w:val="52"/>
           <w:szCs w:val="52"/>
         </w:rPr>
-        <w:t>Show/Hide correct scene when player interacts with the right object in</w:t>
-      </w:r>
-      <w:r>
-        <w:rPr>
-          <w:sz w:val="52"/>
-          <w:szCs w:val="52"/>
-        </w:rPr>
-        <w:t>.</w:t>
+        <w:t>Show/Hide correct scene when player interacts with the right object in.</w:t>
       </w:r>
     </w:p>
     <w:p>
@@ -531,14 +524,7 @@
           <w:sz w:val="52"/>
           <w:szCs w:val="52"/>
         </w:rPr>
-        <w:t xml:space="preserve">Create signal using signal hub </w:t>
-      </w:r>
-      <w:r>
-        <w:rPr>
-          <w:sz w:val="52"/>
-          <w:szCs w:val="52"/>
-        </w:rPr>
-        <w:t xml:space="preserve">when quit button is </w:t>
+        <w:t xml:space="preserve">Create signal using signal hub when quit button is </w:t>
       </w:r>
       <w:proofErr w:type="spellStart"/>
       <w:r>
@@ -638,15 +624,7 @@
           <w:szCs w:val="52"/>
         </w:rPr>
         <w:lastRenderedPageBreak/>
-        <w:t>Create a signal</w:t>
-      </w:r>
-      <w:r>
-        <w:rPr>
-          <w:color w:val="4EA72E" w:themeColor="accent6"/>
-          <w:sz w:val="52"/>
-          <w:szCs w:val="52"/>
-        </w:rPr>
-        <w:t xml:space="preserve"> in signal hub and connect it to the </w:t>
+        <w:t xml:space="preserve">Create a signal in signal hub and connect it to the </w:t>
       </w:r>
       <w:proofErr w:type="spellStart"/>
       <w:r>
@@ -1200,6 +1178,22 @@
     </w:p>
     <w:p>
       <w:pPr>
+        <w:ind w:left="1440"/>
+        <w:rPr>
+          <w:sz w:val="52"/>
+          <w:szCs w:val="52"/>
+        </w:rPr>
+      </w:pPr>
+      <w:r>
+        <w:rPr>
+          <w:sz w:val="52"/>
+          <w:szCs w:val="52"/>
+        </w:rPr>
+        <w:t>DONE</w:t>
+      </w:r>
+    </w:p>
+    <w:p>
+      <w:pPr>
         <w:pStyle w:val="ListParagraph"/>
         <w:numPr>
           <w:ilvl w:val="1"/>
@@ -1419,6 +1413,32 @@
     </w:p>
     <w:p>
       <w:pPr>
+        <w:pStyle w:val="ListParagraph"/>
+        <w:ind w:left="1440"/>
+        <w:rPr>
+          <w:sz w:val="52"/>
+          <w:szCs w:val="52"/>
+        </w:rPr>
+      </w:pPr>
+      <w:r>
+        <w:rPr>
+          <w:sz w:val="52"/>
+          <w:szCs w:val="52"/>
+        </w:rPr>
+        <w:t>DONE</w:t>
+      </w:r>
+    </w:p>
+    <w:p>
+      <w:pPr>
+        <w:ind w:left="1440"/>
+        <w:rPr>
+          <w:sz w:val="52"/>
+          <w:szCs w:val="52"/>
+        </w:rPr>
+      </w:pPr>
+    </w:p>
+    <w:p>
+      <w:pPr>
         <w:rPr>
           <w:sz w:val="52"/>
           <w:szCs w:val="52"/>
@@ -1507,18 +1527,242 @@
           <w:sz w:val="52"/>
           <w:szCs w:val="52"/>
         </w:rPr>
+        <w:t xml:space="preserve">should store correct image in </w:t>
+      </w:r>
+      <w:proofErr w:type="spellStart"/>
+      <w:r>
+        <w:rPr>
+          <w:sz w:val="52"/>
+          <w:szCs w:val="52"/>
+        </w:rPr>
+        <w:t>image_prompt</w:t>
+      </w:r>
+      <w:proofErr w:type="spellEnd"/>
+    </w:p>
+    <w:p>
+      <w:pPr>
+        <w:pStyle w:val="ListParagraph"/>
+        <w:numPr>
+          <w:ilvl w:val="2"/>
+          <w:numId w:val="2"/>
+        </w:numPr>
+        <w:rPr>
+          <w:sz w:val="52"/>
+          <w:szCs w:val="52"/>
+        </w:rPr>
+      </w:pPr>
+      <w:r>
+        <w:rPr>
+          <w:sz w:val="52"/>
+          <w:szCs w:val="52"/>
+        </w:rPr>
+        <w:t xml:space="preserve">should randomly store meanings of all 4 signs of question in </w:t>
+      </w:r>
+      <w:proofErr w:type="spellStart"/>
+      <w:r>
+        <w:rPr>
+          <w:sz w:val="52"/>
+          <w:szCs w:val="52"/>
+        </w:rPr>
+        <w:t>Meaning_</w:t>
+      </w:r>
+      <w:proofErr w:type="gramStart"/>
+      <w:r>
+        <w:rPr>
+          <w:sz w:val="52"/>
+          <w:szCs w:val="52"/>
+        </w:rPr>
+        <w:t>A,Meaning</w:t>
+      </w:r>
+      <w:proofErr w:type="gramEnd"/>
+      <w:r>
+        <w:rPr>
+          <w:sz w:val="52"/>
+          <w:szCs w:val="52"/>
+        </w:rPr>
+        <w:t>_</w:t>
+      </w:r>
+      <w:proofErr w:type="gramStart"/>
+      <w:r>
+        <w:rPr>
+          <w:sz w:val="52"/>
+          <w:szCs w:val="52"/>
+        </w:rPr>
+        <w:t>B,Meaning</w:t>
+      </w:r>
+      <w:proofErr w:type="gramEnd"/>
+      <w:r>
+        <w:rPr>
+          <w:sz w:val="52"/>
+          <w:szCs w:val="52"/>
+        </w:rPr>
+        <w:t>_C</w:t>
+      </w:r>
+      <w:proofErr w:type="spellEnd"/>
+      <w:r>
+        <w:rPr>
+          <w:sz w:val="52"/>
+          <w:szCs w:val="52"/>
+        </w:rPr>
+        <w:t xml:space="preserve">, and </w:t>
+      </w:r>
+      <w:proofErr w:type="spellStart"/>
+      <w:r>
+        <w:rPr>
+          <w:sz w:val="52"/>
+          <w:szCs w:val="52"/>
+        </w:rPr>
+        <w:t>Meaning_D</w:t>
+      </w:r>
+      <w:proofErr w:type="spellEnd"/>
+    </w:p>
+    <w:p>
+      <w:pPr>
+        <w:pStyle w:val="ListParagraph"/>
+        <w:numPr>
+          <w:ilvl w:val="2"/>
+          <w:numId w:val="2"/>
+        </w:numPr>
+        <w:rPr>
+          <w:sz w:val="52"/>
+          <w:szCs w:val="52"/>
+        </w:rPr>
+      </w:pPr>
+      <w:r>
+        <w:rPr>
+          <w:sz w:val="52"/>
+          <w:szCs w:val="52"/>
+        </w:rPr>
+        <w:t xml:space="preserve">should assign </w:t>
+      </w:r>
+      <w:proofErr w:type="gramStart"/>
+      <w:r>
+        <w:rPr>
+          <w:sz w:val="52"/>
+          <w:szCs w:val="52"/>
+        </w:rPr>
+        <w:t>A,B</w:t>
+      </w:r>
+      <w:proofErr w:type="gramEnd"/>
+      <w:r>
+        <w:rPr>
+          <w:sz w:val="52"/>
+          <w:szCs w:val="52"/>
+        </w:rPr>
+        <w:t xml:space="preserve">,C, or D to </w:t>
+      </w:r>
+      <w:proofErr w:type="spellStart"/>
+      <w:r>
+        <w:rPr>
+          <w:sz w:val="52"/>
+          <w:szCs w:val="52"/>
+        </w:rPr>
+        <w:t>correct_answer</w:t>
+      </w:r>
+      <w:proofErr w:type="spellEnd"/>
+    </w:p>
+    <w:p>
+      <w:pPr>
+        <w:pStyle w:val="ListParagraph"/>
+        <w:ind w:firstLine="720"/>
+        <w:rPr>
+          <w:sz w:val="52"/>
+          <w:szCs w:val="52"/>
+        </w:rPr>
+      </w:pPr>
+      <w:r>
+        <w:rPr>
+          <w:sz w:val="52"/>
+          <w:szCs w:val="52"/>
+        </w:rPr>
+        <w:t>DONE</w:t>
+      </w:r>
+    </w:p>
+    <w:p>
+      <w:pPr>
+        <w:pStyle w:val="ListParagraph"/>
+        <w:ind w:firstLine="720"/>
+        <w:rPr>
+          <w:sz w:val="52"/>
+          <w:szCs w:val="52"/>
+        </w:rPr>
+      </w:pPr>
+    </w:p>
+    <w:p>
+      <w:pPr>
+        <w:pStyle w:val="ListParagraph"/>
+        <w:ind w:firstLine="720"/>
+        <w:rPr>
+          <w:sz w:val="52"/>
+          <w:szCs w:val="52"/>
+        </w:rPr>
+      </w:pPr>
+    </w:p>
+    <w:p>
+      <w:pPr>
+        <w:pStyle w:val="ListParagraph"/>
+        <w:ind w:firstLine="720"/>
+        <w:rPr>
+          <w:sz w:val="52"/>
+          <w:szCs w:val="52"/>
+        </w:rPr>
+      </w:pPr>
+    </w:p>
+    <w:p>
+      <w:pPr>
+        <w:pStyle w:val="ListParagraph"/>
+        <w:ind w:firstLine="720"/>
+        <w:rPr>
+          <w:sz w:val="52"/>
+          <w:szCs w:val="52"/>
+        </w:rPr>
+      </w:pPr>
+    </w:p>
+    <w:p>
+      <w:pPr>
+        <w:pStyle w:val="ListParagraph"/>
+        <w:numPr>
+          <w:ilvl w:val="1"/>
+          <w:numId w:val="2"/>
+        </w:numPr>
+        <w:rPr>
+          <w:sz w:val="52"/>
+          <w:szCs w:val="52"/>
+        </w:rPr>
+      </w:pPr>
+      <w:proofErr w:type="spellStart"/>
+      <w:r>
+        <w:rPr>
+          <w:sz w:val="52"/>
+          <w:szCs w:val="52"/>
+        </w:rPr>
         <w:lastRenderedPageBreak/>
-        <w:t xml:space="preserve">should store correct image in </w:t>
-      </w:r>
-      <w:proofErr w:type="spellStart"/>
-      <w:r>
-        <w:rPr>
-          <w:sz w:val="52"/>
-          <w:szCs w:val="52"/>
-        </w:rPr>
-        <w:t>image_prompt</w:t>
-      </w:r>
-      <w:proofErr w:type="spellEnd"/>
+        <w:t>answer_</w:t>
+      </w:r>
+      <w:proofErr w:type="gramStart"/>
+      <w:r>
+        <w:rPr>
+          <w:sz w:val="52"/>
+          <w:szCs w:val="52"/>
+        </w:rPr>
+        <w:t>picked</w:t>
+      </w:r>
+      <w:proofErr w:type="spellEnd"/>
+      <w:r>
+        <w:rPr>
+          <w:sz w:val="52"/>
+          <w:szCs w:val="52"/>
+        </w:rPr>
+        <w:t>(</w:t>
+      </w:r>
+      <w:proofErr w:type="gramEnd"/>
+      <w:r>
+        <w:rPr>
+          <w:sz w:val="52"/>
+          <w:szCs w:val="52"/>
+        </w:rPr>
+        <w:t>String)</w:t>
+      </w:r>
     </w:p>
     <w:p>
       <w:pPr>
@@ -1537,31 +1781,135 @@
           <w:sz w:val="52"/>
           <w:szCs w:val="52"/>
         </w:rPr>
-        <w:t xml:space="preserve">should randomly store meanings of all 4 signs of question in </w:t>
-      </w:r>
-      <w:proofErr w:type="spellStart"/>
-      <w:r>
-        <w:rPr>
-          <w:sz w:val="52"/>
-          <w:szCs w:val="52"/>
-        </w:rPr>
-        <w:t>Meaning_</w:t>
+        <w:t xml:space="preserve">needs to compare selected _answer to </w:t>
+      </w:r>
+      <w:proofErr w:type="spellStart"/>
+      <w:r>
+        <w:rPr>
+          <w:sz w:val="52"/>
+          <w:szCs w:val="52"/>
+        </w:rPr>
+        <w:t>correct_answer</w:t>
+      </w:r>
+      <w:proofErr w:type="spellEnd"/>
+      <w:r>
+        <w:rPr>
+          <w:sz w:val="52"/>
+          <w:szCs w:val="52"/>
+        </w:rPr>
+        <w:t xml:space="preserve"> and increment.</w:t>
+      </w:r>
+    </w:p>
+    <w:p>
+      <w:pPr>
+        <w:pStyle w:val="ListParagraph"/>
+        <w:numPr>
+          <w:ilvl w:val="2"/>
+          <w:numId w:val="2"/>
+        </w:numPr>
+        <w:rPr>
+          <w:sz w:val="52"/>
+          <w:szCs w:val="52"/>
+        </w:rPr>
+      </w:pPr>
+      <w:proofErr w:type="spellStart"/>
+      <w:r>
+        <w:rPr>
+          <w:color w:val="B3E5A1" w:themeColor="accent6" w:themeTint="66"/>
+          <w:sz w:val="52"/>
+          <w:szCs w:val="52"/>
+        </w:rPr>
+        <w:t>Answer_picked</w:t>
+      </w:r>
+      <w:proofErr w:type="spellEnd"/>
+      <w:r>
+        <w:rPr>
+          <w:color w:val="B3E5A1" w:themeColor="accent6" w:themeTint="66"/>
+          <w:sz w:val="52"/>
+          <w:szCs w:val="52"/>
+        </w:rPr>
+        <w:t xml:space="preserve"> calls </w:t>
+      </w:r>
+      <w:proofErr w:type="spellStart"/>
+      <w:r>
+        <w:rPr>
+          <w:color w:val="B3E5A1" w:themeColor="accent6" w:themeTint="66"/>
+          <w:sz w:val="52"/>
+          <w:szCs w:val="52"/>
+        </w:rPr>
+        <w:t>next_</w:t>
       </w:r>
       <w:proofErr w:type="gramStart"/>
       <w:r>
         <w:rPr>
-          <w:sz w:val="52"/>
-          <w:szCs w:val="52"/>
-        </w:rPr>
-        <w:t>A,Meaning</w:t>
+          <w:color w:val="B3E5A1" w:themeColor="accent6" w:themeTint="66"/>
+          <w:sz w:val="52"/>
+          <w:szCs w:val="52"/>
+        </w:rPr>
+        <w:t>answer</w:t>
+      </w:r>
+      <w:proofErr w:type="spellEnd"/>
+      <w:r>
+        <w:rPr>
+          <w:color w:val="B3E5A1" w:themeColor="accent6" w:themeTint="66"/>
+          <w:sz w:val="52"/>
+          <w:szCs w:val="52"/>
+        </w:rPr>
+        <w:t>(</w:t>
       </w:r>
       <w:proofErr w:type="gramEnd"/>
       <w:r>
         <w:rPr>
-          <w:sz w:val="52"/>
-          <w:szCs w:val="52"/>
-        </w:rPr>
-        <w:t>_</w:t>
+          <w:color w:val="B3E5A1" w:themeColor="accent6" w:themeTint="66"/>
+          <w:sz w:val="52"/>
+          <w:szCs w:val="52"/>
+        </w:rPr>
+        <w:t>)</w:t>
+      </w:r>
+      <w:r>
+        <w:rPr>
+          <w:color w:val="B3E5A1" w:themeColor="accent6" w:themeTint="66"/>
+          <w:sz w:val="52"/>
+          <w:szCs w:val="52"/>
+        </w:rPr>
+        <w:t xml:space="preserve"> to cycle through questions</w:t>
+      </w:r>
+    </w:p>
+    <w:p>
+      <w:pPr>
+        <w:ind w:left="1440" w:firstLine="360"/>
+        <w:rPr>
+          <w:sz w:val="52"/>
+          <w:szCs w:val="52"/>
+        </w:rPr>
+      </w:pPr>
+      <w:r>
+        <w:rPr>
+          <w:sz w:val="52"/>
+          <w:szCs w:val="52"/>
+        </w:rPr>
+        <w:t>DONE</w:t>
+      </w:r>
+    </w:p>
+    <w:p>
+      <w:pPr>
+        <w:pStyle w:val="ListParagraph"/>
+        <w:numPr>
+          <w:ilvl w:val="1"/>
+          <w:numId w:val="2"/>
+        </w:numPr>
+        <w:rPr>
+          <w:sz w:val="52"/>
+          <w:szCs w:val="52"/>
+        </w:rPr>
+      </w:pPr>
+      <w:proofErr w:type="spellStart"/>
+      <w:r>
+        <w:rPr>
+          <w:sz w:val="52"/>
+          <w:szCs w:val="52"/>
+        </w:rPr>
+        <w:t>Start_</w:t>
       </w:r>
       <w:proofErr w:type="gramStart"/>
       <w:r>
@@ -1569,33 +1917,33 @@
           <w:sz w:val="52"/>
           <w:szCs w:val="52"/>
         </w:rPr>
-        <w:t>B,Meaning</w:t>
-      </w:r>
+        <w:t>quiz</w:t>
+      </w:r>
+      <w:proofErr w:type="spellEnd"/>
+      <w:r>
+        <w:rPr>
+          <w:sz w:val="52"/>
+          <w:szCs w:val="52"/>
+        </w:rPr>
+        <w:t>(Array[</w:t>
+      </w:r>
+      <w:proofErr w:type="spellStart"/>
       <w:proofErr w:type="gramEnd"/>
       <w:r>
         <w:rPr>
           <w:sz w:val="52"/>
           <w:szCs w:val="52"/>
         </w:rPr>
-        <w:t>_C</w:t>
-      </w:r>
-      <w:proofErr w:type="spellEnd"/>
-      <w:r>
-        <w:rPr>
-          <w:sz w:val="52"/>
-          <w:szCs w:val="52"/>
-        </w:rPr>
-        <w:t xml:space="preserve">, and </w:t>
-      </w:r>
-      <w:proofErr w:type="spellStart"/>
-      <w:r>
-        <w:rPr>
-          <w:sz w:val="52"/>
-          <w:szCs w:val="52"/>
-        </w:rPr>
-        <w:t>Meaning_D</w:t>
-      </w:r>
-      <w:proofErr w:type="spellEnd"/>
+        <w:t>ASLQuestion</w:t>
+      </w:r>
+      <w:proofErr w:type="spellEnd"/>
+      <w:r>
+        <w:rPr>
+          <w:sz w:val="52"/>
+          <w:szCs w:val="52"/>
+        </w:rPr>
+        <w:t>])</w:t>
+      </w:r>
     </w:p>
     <w:p>
       <w:pPr>
@@ -1614,33 +1962,165 @@
           <w:sz w:val="52"/>
           <w:szCs w:val="52"/>
         </w:rPr>
-        <w:t xml:space="preserve">should assign </w:t>
+        <w:t>Should randomize the type of question displayed</w:t>
+      </w:r>
+    </w:p>
+    <w:p>
+      <w:pPr>
+        <w:pStyle w:val="ListParagraph"/>
+        <w:numPr>
+          <w:ilvl w:val="2"/>
+          <w:numId w:val="2"/>
+        </w:numPr>
+        <w:rPr>
+          <w:color w:val="B3E5A1" w:themeColor="accent6" w:themeTint="66"/>
+          <w:sz w:val="52"/>
+          <w:szCs w:val="52"/>
+        </w:rPr>
+      </w:pPr>
+      <w:r>
+        <w:rPr>
+          <w:color w:val="B3E5A1" w:themeColor="accent6" w:themeTint="66"/>
+          <w:sz w:val="52"/>
+          <w:szCs w:val="52"/>
+        </w:rPr>
+        <w:t>Should pause cycling through the array of questions until player selects an answer to each question</w:t>
+      </w:r>
+    </w:p>
+    <w:p>
+      <w:pPr>
+        <w:pStyle w:val="ListParagraph"/>
+        <w:numPr>
+          <w:ilvl w:val="3"/>
+          <w:numId w:val="2"/>
+        </w:numPr>
+        <w:rPr>
+          <w:color w:val="B3E5A1" w:themeColor="accent6" w:themeTint="66"/>
+          <w:sz w:val="52"/>
+          <w:szCs w:val="52"/>
+        </w:rPr>
+      </w:pPr>
+      <w:r>
+        <w:rPr>
+          <w:color w:val="B3E5A1" w:themeColor="accent6" w:themeTint="66"/>
+          <w:sz w:val="52"/>
+          <w:szCs w:val="52"/>
+        </w:rPr>
+        <w:lastRenderedPageBreak/>
+        <w:t xml:space="preserve">This was accomplished through a helper function called </w:t>
+      </w:r>
+      <w:proofErr w:type="spellStart"/>
+      <w:r>
+        <w:rPr>
+          <w:color w:val="B3E5A1" w:themeColor="accent6" w:themeTint="66"/>
+          <w:sz w:val="52"/>
+          <w:szCs w:val="52"/>
+        </w:rPr>
+        <w:t>next_</w:t>
       </w:r>
       <w:proofErr w:type="gramStart"/>
       <w:r>
         <w:rPr>
-          <w:sz w:val="52"/>
-          <w:szCs w:val="52"/>
-        </w:rPr>
-        <w:t>A,B</w:t>
+          <w:color w:val="B3E5A1" w:themeColor="accent6" w:themeTint="66"/>
+          <w:sz w:val="52"/>
+          <w:szCs w:val="52"/>
+        </w:rPr>
+        <w:t>question</w:t>
+      </w:r>
+      <w:proofErr w:type="spellEnd"/>
+      <w:r>
+        <w:rPr>
+          <w:color w:val="B3E5A1" w:themeColor="accent6" w:themeTint="66"/>
+          <w:sz w:val="52"/>
+          <w:szCs w:val="52"/>
+        </w:rPr>
+        <w:t>(</w:t>
       </w:r>
       <w:proofErr w:type="gramEnd"/>
       <w:r>
         <w:rPr>
-          <w:sz w:val="52"/>
-          <w:szCs w:val="52"/>
-        </w:rPr>
-        <w:t xml:space="preserve">,C, or D to </w:t>
-      </w:r>
-      <w:proofErr w:type="spellStart"/>
-      <w:r>
-        <w:rPr>
-          <w:sz w:val="52"/>
-          <w:szCs w:val="52"/>
-        </w:rPr>
-        <w:t>correct_answer</w:t>
-      </w:r>
-      <w:proofErr w:type="spellEnd"/>
+          <w:color w:val="B3E5A1" w:themeColor="accent6" w:themeTint="66"/>
+          <w:sz w:val="52"/>
+          <w:szCs w:val="52"/>
+        </w:rPr>
+        <w:t>)</w:t>
+      </w:r>
+    </w:p>
+    <w:p>
+      <w:pPr>
+        <w:pStyle w:val="ListParagraph"/>
+        <w:numPr>
+          <w:ilvl w:val="2"/>
+          <w:numId w:val="2"/>
+        </w:numPr>
+        <w:rPr>
+          <w:strike/>
+          <w:sz w:val="52"/>
+          <w:szCs w:val="52"/>
+        </w:rPr>
+      </w:pPr>
+      <w:r>
+        <w:rPr>
+          <w:strike/>
+          <w:sz w:val="52"/>
+          <w:szCs w:val="52"/>
+        </w:rPr>
+        <w:t xml:space="preserve">Should run </w:t>
+      </w:r>
+      <w:proofErr w:type="spellStart"/>
+      <w:r>
+        <w:rPr>
+          <w:strike/>
+          <w:sz w:val="52"/>
+          <w:szCs w:val="52"/>
+        </w:rPr>
+        <w:t>quiz_</w:t>
+      </w:r>
+      <w:proofErr w:type="gramStart"/>
+      <w:r>
+        <w:rPr>
+          <w:strike/>
+          <w:sz w:val="52"/>
+          <w:szCs w:val="52"/>
+        </w:rPr>
+        <w:t>finished</w:t>
+      </w:r>
+      <w:proofErr w:type="spellEnd"/>
+      <w:r>
+        <w:rPr>
+          <w:strike/>
+          <w:sz w:val="52"/>
+          <w:szCs w:val="52"/>
+        </w:rPr>
+        <w:t>(</w:t>
+      </w:r>
+      <w:proofErr w:type="gramEnd"/>
+      <w:r>
+        <w:rPr>
+          <w:strike/>
+          <w:sz w:val="52"/>
+          <w:szCs w:val="52"/>
+        </w:rPr>
+        <w:t>)</w:t>
+      </w:r>
+    </w:p>
+    <w:p>
+      <w:pPr>
+        <w:ind w:left="1080"/>
+        <w:rPr>
+          <w:color w:val="000000" w:themeColor="text1"/>
+          <w:sz w:val="52"/>
+          <w:szCs w:val="52"/>
+        </w:rPr>
+      </w:pPr>
+      <w:r>
+        <w:rPr>
+          <w:color w:val="000000" w:themeColor="text1"/>
+          <w:sz w:val="52"/>
+          <w:szCs w:val="52"/>
+        </w:rPr>
+        <w:t>DONE</w:t>
+      </w:r>
     </w:p>
     <w:p>
       <w:pPr>
@@ -1650,29 +2130,33 @@
           <w:numId w:val="2"/>
         </w:numPr>
         <w:rPr>
-          <w:sz w:val="52"/>
-          <w:szCs w:val="52"/>
-        </w:rPr>
-      </w:pPr>
-      <w:proofErr w:type="spellStart"/>
-      <w:r>
-        <w:rPr>
-          <w:sz w:val="52"/>
-          <w:szCs w:val="52"/>
-        </w:rPr>
-        <w:t>answer_</w:t>
+          <w:strike/>
+          <w:sz w:val="52"/>
+          <w:szCs w:val="52"/>
+        </w:rPr>
+      </w:pPr>
+      <w:proofErr w:type="spellStart"/>
+      <w:r>
+        <w:rPr>
+          <w:strike/>
+          <w:sz w:val="52"/>
+          <w:szCs w:val="52"/>
+        </w:rPr>
+        <w:t>quiz_</w:t>
       </w:r>
       <w:proofErr w:type="gramStart"/>
       <w:r>
         <w:rPr>
-          <w:sz w:val="52"/>
-          <w:szCs w:val="52"/>
-        </w:rPr>
-        <w:t>picked</w:t>
-      </w:r>
-      <w:proofErr w:type="spellEnd"/>
-      <w:r>
-        <w:rPr>
+          <w:strike/>
+          <w:sz w:val="52"/>
+          <w:szCs w:val="52"/>
+        </w:rPr>
+        <w:t>finished</w:t>
+      </w:r>
+      <w:proofErr w:type="spellEnd"/>
+      <w:r>
+        <w:rPr>
+          <w:strike/>
           <w:sz w:val="52"/>
           <w:szCs w:val="52"/>
         </w:rPr>
@@ -1681,10 +2165,11 @@
       <w:proofErr w:type="gramEnd"/>
       <w:r>
         <w:rPr>
-          <w:sz w:val="52"/>
-          <w:szCs w:val="52"/>
-        </w:rPr>
-        <w:t>String)</w:t>
+          <w:strike/>
+          <w:sz w:val="52"/>
+          <w:szCs w:val="52"/>
+        </w:rPr>
+        <w:t>)</w:t>
       </w:r>
     </w:p>
     <w:p>
@@ -1695,33 +2180,158 @@
           <w:numId w:val="2"/>
         </w:numPr>
         <w:rPr>
-          <w:sz w:val="52"/>
-          <w:szCs w:val="52"/>
-        </w:rPr>
-      </w:pPr>
-      <w:r>
-        <w:rPr>
-          <w:sz w:val="52"/>
-          <w:szCs w:val="52"/>
-        </w:rPr>
-        <w:t xml:space="preserve">needs to compare selected _answer to </w:t>
-      </w:r>
-      <w:proofErr w:type="spellStart"/>
-      <w:r>
-        <w:rPr>
-          <w:sz w:val="52"/>
-          <w:szCs w:val="52"/>
-        </w:rPr>
-        <w:t>correct_answer</w:t>
-      </w:r>
-      <w:proofErr w:type="spellEnd"/>
-      <w:r>
-        <w:rPr>
-          <w:sz w:val="52"/>
-          <w:szCs w:val="52"/>
-        </w:rPr>
-        <w:t xml:space="preserve"> and increment.</w:t>
-      </w:r>
+          <w:strike/>
+          <w:sz w:val="52"/>
+          <w:szCs w:val="52"/>
+        </w:rPr>
+      </w:pPr>
+      <w:r>
+        <w:rPr>
+          <w:strike/>
+          <w:sz w:val="52"/>
+          <w:szCs w:val="52"/>
+        </w:rPr>
+        <w:t xml:space="preserve">Should emit a signal with </w:t>
+      </w:r>
+      <w:proofErr w:type="spellStart"/>
+      <w:r>
+        <w:rPr>
+          <w:strike/>
+          <w:sz w:val="52"/>
+          <w:szCs w:val="52"/>
+        </w:rPr>
+        <w:t>answered_correclty</w:t>
+      </w:r>
+      <w:proofErr w:type="spellEnd"/>
+      <w:r>
+        <w:rPr>
+          <w:strike/>
+          <w:sz w:val="52"/>
+          <w:szCs w:val="52"/>
+        </w:rPr>
+        <w:t xml:space="preserve"> through signal </w:t>
+      </w:r>
+      <w:proofErr w:type="gramStart"/>
+      <w:r>
+        <w:rPr>
+          <w:strike/>
+          <w:sz w:val="52"/>
+          <w:szCs w:val="52"/>
+        </w:rPr>
+        <w:t>hub .</w:t>
+      </w:r>
+      <w:proofErr w:type="gramEnd"/>
+    </w:p>
+    <w:p>
+      <w:pPr>
+        <w:pStyle w:val="ListParagraph"/>
+        <w:numPr>
+          <w:ilvl w:val="3"/>
+          <w:numId w:val="2"/>
+        </w:numPr>
+        <w:rPr>
+          <w:strike/>
+          <w:sz w:val="52"/>
+          <w:szCs w:val="52"/>
+        </w:rPr>
+      </w:pPr>
+      <w:r>
+        <w:rPr>
+          <w:strike/>
+          <w:sz w:val="52"/>
+          <w:szCs w:val="52"/>
+        </w:rPr>
+        <w:t>Need to create signal in signal hub first that holds an int.</w:t>
+      </w:r>
+    </w:p>
+    <w:p>
+      <w:pPr>
+        <w:pStyle w:val="ListParagraph"/>
+        <w:numPr>
+          <w:ilvl w:val="2"/>
+          <w:numId w:val="2"/>
+        </w:numPr>
+        <w:rPr>
+          <w:strike/>
+          <w:sz w:val="52"/>
+          <w:szCs w:val="52"/>
+        </w:rPr>
+      </w:pPr>
+      <w:r>
+        <w:rPr>
+          <w:strike/>
+          <w:sz w:val="52"/>
+          <w:szCs w:val="52"/>
+        </w:rPr>
+        <w:t>Should hide all containers</w:t>
+      </w:r>
+    </w:p>
+    <w:p>
+      <w:pPr>
+        <w:pStyle w:val="ListParagraph"/>
+        <w:numPr>
+          <w:ilvl w:val="2"/>
+          <w:numId w:val="2"/>
+        </w:numPr>
+        <w:rPr>
+          <w:color w:val="B3E5A1" w:themeColor="accent6" w:themeTint="66"/>
+          <w:sz w:val="52"/>
+          <w:szCs w:val="52"/>
+        </w:rPr>
+      </w:pPr>
+      <w:r>
+        <w:rPr>
+          <w:color w:val="B3E5A1" w:themeColor="accent6" w:themeTint="66"/>
+          <w:sz w:val="52"/>
+          <w:szCs w:val="52"/>
+        </w:rPr>
+        <w:t xml:space="preserve">This function was replaced with </w:t>
+      </w:r>
+      <w:proofErr w:type="spellStart"/>
+      <w:r>
+        <w:rPr>
+          <w:color w:val="B3E5A1" w:themeColor="accent6" w:themeTint="66"/>
+          <w:sz w:val="52"/>
+          <w:szCs w:val="52"/>
+        </w:rPr>
+        <w:t>next_</w:t>
+      </w:r>
+      <w:proofErr w:type="gramStart"/>
+      <w:r>
+        <w:rPr>
+          <w:color w:val="B3E5A1" w:themeColor="accent6" w:themeTint="66"/>
+          <w:sz w:val="52"/>
+          <w:szCs w:val="52"/>
+        </w:rPr>
+        <w:t>question</w:t>
+      </w:r>
+      <w:proofErr w:type="spellEnd"/>
+      <w:r>
+        <w:rPr>
+          <w:color w:val="B3E5A1" w:themeColor="accent6" w:themeTint="66"/>
+          <w:sz w:val="52"/>
+          <w:szCs w:val="52"/>
+        </w:rPr>
+        <w:t>(</w:t>
+      </w:r>
+      <w:proofErr w:type="gramEnd"/>
+      <w:r>
+        <w:rPr>
+          <w:color w:val="B3E5A1" w:themeColor="accent6" w:themeTint="66"/>
+          <w:sz w:val="52"/>
+          <w:szCs w:val="52"/>
+        </w:rPr>
+        <w:t>)</w:t>
+      </w:r>
+    </w:p>
+    <w:p>
+      <w:pPr>
+        <w:rPr>
+          <w:color w:val="B3E5A1" w:themeColor="accent6" w:themeTint="66"/>
+          <w:sz w:val="52"/>
+          <w:szCs w:val="52"/>
+        </w:rPr>
+      </w:pPr>
     </w:p>
     <w:p>
       <w:pPr>
@@ -1731,50 +2341,47 @@
           <w:numId w:val="2"/>
         </w:numPr>
         <w:rPr>
-          <w:sz w:val="52"/>
-          <w:szCs w:val="52"/>
-        </w:rPr>
-      </w:pPr>
-      <w:proofErr w:type="spellStart"/>
-      <w:r>
-        <w:rPr>
-          <w:sz w:val="52"/>
-          <w:szCs w:val="52"/>
-        </w:rPr>
-        <w:t>Start_</w:t>
+          <w:color w:val="B3E5A1" w:themeColor="accent6" w:themeTint="66"/>
+          <w:sz w:val="52"/>
+          <w:szCs w:val="52"/>
+        </w:rPr>
+      </w:pPr>
+      <w:proofErr w:type="spellStart"/>
+      <w:r>
+        <w:rPr>
+          <w:color w:val="B3E5A1" w:themeColor="accent6" w:themeTint="66"/>
+          <w:sz w:val="52"/>
+          <w:szCs w:val="52"/>
+        </w:rPr>
+        <w:lastRenderedPageBreak/>
+        <w:t>Next_</w:t>
       </w:r>
       <w:proofErr w:type="gramStart"/>
       <w:r>
         <w:rPr>
-          <w:sz w:val="52"/>
-          <w:szCs w:val="52"/>
-        </w:rPr>
-        <w:t>quiz</w:t>
-      </w:r>
-      <w:proofErr w:type="spellEnd"/>
-      <w:r>
-        <w:rPr>
-          <w:sz w:val="52"/>
-          <w:szCs w:val="52"/>
-        </w:rPr>
-        <w:t>(Array[</w:t>
-      </w:r>
-      <w:proofErr w:type="spellStart"/>
+          <w:color w:val="B3E5A1" w:themeColor="accent6" w:themeTint="66"/>
+          <w:sz w:val="52"/>
+          <w:szCs w:val="52"/>
+        </w:rPr>
+        <w:t>question</w:t>
+      </w:r>
+      <w:proofErr w:type="spellEnd"/>
+      <w:r>
+        <w:rPr>
+          <w:color w:val="B3E5A1" w:themeColor="accent6" w:themeTint="66"/>
+          <w:sz w:val="52"/>
+          <w:szCs w:val="52"/>
+        </w:rPr>
+        <w:t>(</w:t>
+      </w:r>
       <w:proofErr w:type="gramEnd"/>
       <w:r>
         <w:rPr>
-          <w:sz w:val="52"/>
-          <w:szCs w:val="52"/>
-        </w:rPr>
-        <w:t>ASLQuestion</w:t>
-      </w:r>
-      <w:proofErr w:type="spellEnd"/>
-      <w:r>
-        <w:rPr>
-          <w:sz w:val="52"/>
-          <w:szCs w:val="52"/>
-        </w:rPr>
-        <w:t>])</w:t>
+          <w:color w:val="B3E5A1" w:themeColor="accent6" w:themeTint="66"/>
+          <w:sz w:val="52"/>
+          <w:szCs w:val="52"/>
+        </w:rPr>
+        <w:t>)</w:t>
       </w:r>
     </w:p>
     <w:p>
@@ -1785,16 +2392,130 @@
           <w:numId w:val="2"/>
         </w:numPr>
         <w:rPr>
-          <w:sz w:val="52"/>
-          <w:szCs w:val="52"/>
-        </w:rPr>
-      </w:pPr>
-      <w:r>
-        <w:rPr>
-          <w:sz w:val="52"/>
-          <w:szCs w:val="52"/>
-        </w:rPr>
-        <w:t>Should randomize the type of question displayed</w:t>
+          <w:color w:val="B3E5A1" w:themeColor="accent6" w:themeTint="66"/>
+          <w:sz w:val="52"/>
+          <w:szCs w:val="52"/>
+        </w:rPr>
+      </w:pPr>
+      <w:r>
+        <w:rPr>
+          <w:color w:val="B3E5A1" w:themeColor="accent6" w:themeTint="66"/>
+          <w:sz w:val="52"/>
+          <w:szCs w:val="52"/>
+        </w:rPr>
+        <w:t xml:space="preserve">Shows next question in the array of questions if there is any left. If </w:t>
+      </w:r>
+      <w:proofErr w:type="gramStart"/>
+      <w:r>
+        <w:rPr>
+          <w:color w:val="B3E5A1" w:themeColor="accent6" w:themeTint="66"/>
+          <w:sz w:val="52"/>
+          <w:szCs w:val="52"/>
+        </w:rPr>
+        <w:t>not</w:t>
+      </w:r>
+      <w:proofErr w:type="gramEnd"/>
+      <w:r>
+        <w:rPr>
+          <w:color w:val="B3E5A1" w:themeColor="accent6" w:themeTint="66"/>
+          <w:sz w:val="52"/>
+          <w:szCs w:val="52"/>
+        </w:rPr>
+        <w:t xml:space="preserve"> it emits </w:t>
+      </w:r>
+      <w:proofErr w:type="spellStart"/>
+      <w:r>
+        <w:rPr>
+          <w:color w:val="B3E5A1" w:themeColor="accent6" w:themeTint="66"/>
+          <w:sz w:val="52"/>
+          <w:szCs w:val="52"/>
+        </w:rPr>
+        <w:t>quiz_finished</w:t>
+      </w:r>
+      <w:proofErr w:type="spellEnd"/>
+      <w:r>
+        <w:rPr>
+          <w:color w:val="B3E5A1" w:themeColor="accent6" w:themeTint="66"/>
+          <w:sz w:val="52"/>
+          <w:szCs w:val="52"/>
+        </w:rPr>
+        <w:t xml:space="preserve"> signal.</w:t>
+      </w:r>
+    </w:p>
+    <w:p>
+      <w:pPr>
+        <w:pStyle w:val="ListParagraph"/>
+        <w:numPr>
+          <w:ilvl w:val="0"/>
+          <w:numId w:val="2"/>
+        </w:numPr>
+        <w:rPr>
+          <w:sz w:val="52"/>
+          <w:szCs w:val="52"/>
+        </w:rPr>
+      </w:pPr>
+      <w:r>
+        <w:rPr>
+          <w:sz w:val="52"/>
+          <w:szCs w:val="52"/>
+        </w:rPr>
+        <w:t>Farm Scene</w:t>
+      </w:r>
+    </w:p>
+    <w:p>
+      <w:pPr>
+        <w:pStyle w:val="ListParagraph"/>
+        <w:numPr>
+          <w:ilvl w:val="1"/>
+          <w:numId w:val="2"/>
+        </w:numPr>
+        <w:rPr>
+          <w:sz w:val="52"/>
+          <w:szCs w:val="52"/>
+        </w:rPr>
+      </w:pPr>
+      <w:r>
+        <w:rPr>
+          <w:sz w:val="52"/>
+          <w:szCs w:val="52"/>
+        </w:rPr>
+        <w:t>Need to instantiate 3 Tree’s, assign difficulty levels, 3 levels of growth, and name (TREE</w:t>
+      </w:r>
+      <w:proofErr w:type="gramStart"/>
+      <w:r>
+        <w:rPr>
+          <w:sz w:val="52"/>
+          <w:szCs w:val="52"/>
+        </w:rPr>
+        <w:t>1,TREE2,TREE</w:t>
+      </w:r>
+      <w:proofErr w:type="gramEnd"/>
+      <w:r>
+        <w:rPr>
+          <w:sz w:val="52"/>
+          <w:szCs w:val="52"/>
+        </w:rPr>
+        <w:t>3)</w:t>
+      </w:r>
+    </w:p>
+    <w:p>
+      <w:pPr>
+        <w:pStyle w:val="ListParagraph"/>
+        <w:numPr>
+          <w:ilvl w:val="1"/>
+          <w:numId w:val="2"/>
+        </w:numPr>
+        <w:rPr>
+          <w:sz w:val="52"/>
+          <w:szCs w:val="52"/>
+        </w:rPr>
+      </w:pPr>
+      <w:r>
+        <w:rPr>
+          <w:sz w:val="52"/>
+          <w:szCs w:val="52"/>
+        </w:rPr>
+        <w:t>Need to get scene background</w:t>
       </w:r>
     </w:p>
     <w:p>
@@ -1814,8 +2535,78 @@
           <w:sz w:val="52"/>
           <w:szCs w:val="52"/>
         </w:rPr>
+        <w:t>Should have a farm area and a home area</w:t>
+      </w:r>
+    </w:p>
+    <w:p>
+      <w:pPr>
+        <w:pStyle w:val="ListParagraph"/>
+        <w:numPr>
+          <w:ilvl w:val="1"/>
+          <w:numId w:val="2"/>
+        </w:numPr>
+        <w:rPr>
+          <w:sz w:val="52"/>
+          <w:szCs w:val="52"/>
+        </w:rPr>
+      </w:pPr>
+      <w:r>
+        <w:rPr>
+          <w:sz w:val="52"/>
+          <w:szCs w:val="52"/>
+        </w:rPr>
+        <w:t xml:space="preserve">Need to add area2D node to scene w/ corresponding </w:t>
+      </w:r>
+      <w:r>
+        <w:rPr>
+          <w:sz w:val="52"/>
+          <w:szCs w:val="52"/>
+        </w:rPr>
+        <w:t xml:space="preserve">CollisionShape2d </w:t>
+      </w:r>
+      <w:r>
+        <w:rPr>
+          <w:sz w:val="52"/>
+          <w:szCs w:val="52"/>
+        </w:rPr>
+        <w:t xml:space="preserve">called </w:t>
+      </w:r>
+      <w:proofErr w:type="spellStart"/>
+      <w:r>
+        <w:rPr>
+          <w:sz w:val="52"/>
+          <w:szCs w:val="52"/>
+        </w:rPr>
+        <w:t>door_to_home</w:t>
+      </w:r>
+      <w:proofErr w:type="spellEnd"/>
+      <w:r>
+        <w:rPr>
+          <w:sz w:val="52"/>
+          <w:szCs w:val="52"/>
+        </w:rPr>
+        <w:t>.</w:t>
+      </w:r>
+    </w:p>
+    <w:p>
+      <w:pPr>
+        <w:pStyle w:val="ListParagraph"/>
+        <w:numPr>
+          <w:ilvl w:val="1"/>
+          <w:numId w:val="2"/>
+        </w:numPr>
+        <w:rPr>
+          <w:sz w:val="52"/>
+          <w:szCs w:val="52"/>
+        </w:rPr>
+      </w:pPr>
+      <w:r>
+        <w:rPr>
+          <w:sz w:val="52"/>
+          <w:szCs w:val="52"/>
+        </w:rPr>
         <w:lastRenderedPageBreak/>
-        <w:t>Should pause cycling through the array of questions until player selects an answer to each question</w:t>
+        <w:t>Need to add StaticBody2D nodes w/ corresponding CollisionShape2D.</w:t>
       </w:r>
     </w:p>
     <w:p>
@@ -1835,39 +2626,27 @@
           <w:sz w:val="52"/>
           <w:szCs w:val="52"/>
         </w:rPr>
-        <w:t xml:space="preserve">Should run </w:t>
-      </w:r>
-      <w:proofErr w:type="spellStart"/>
-      <w:r>
-        <w:rPr>
-          <w:sz w:val="52"/>
-          <w:szCs w:val="52"/>
-        </w:rPr>
-        <w:t>quiz_</w:t>
-      </w:r>
-      <w:proofErr w:type="gramStart"/>
-      <w:r>
-        <w:rPr>
-          <w:sz w:val="52"/>
-          <w:szCs w:val="52"/>
-        </w:rPr>
-        <w:t>finished</w:t>
-      </w:r>
-      <w:proofErr w:type="spellEnd"/>
-      <w:r>
-        <w:rPr>
-          <w:sz w:val="52"/>
-          <w:szCs w:val="52"/>
-        </w:rPr>
-        <w:t>(</w:t>
-      </w:r>
-      <w:proofErr w:type="gramEnd"/>
-      <w:r>
-        <w:rPr>
-          <w:sz w:val="52"/>
-          <w:szCs w:val="52"/>
-        </w:rPr>
-        <w:t>)</w:t>
+        <w:t>Stop player from walking on top of home.</w:t>
+      </w:r>
+    </w:p>
+    <w:p>
+      <w:pPr>
+        <w:pStyle w:val="ListParagraph"/>
+        <w:numPr>
+          <w:ilvl w:val="2"/>
+          <w:numId w:val="2"/>
+        </w:numPr>
+        <w:rPr>
+          <w:sz w:val="52"/>
+          <w:szCs w:val="52"/>
+        </w:rPr>
+      </w:pPr>
+      <w:r>
+        <w:rPr>
+          <w:sz w:val="52"/>
+          <w:szCs w:val="52"/>
+        </w:rPr>
+        <w:t>Set world boundaries to stop player from walking out of the map.</w:t>
       </w:r>
     </w:p>
     <w:p>
@@ -1882,37 +2661,153 @@
           <w:szCs w:val="52"/>
         </w:rPr>
       </w:pPr>
-      <w:proofErr w:type="spellStart"/>
-      <w:r>
-        <w:rPr>
-          <w:sz w:val="52"/>
-          <w:szCs w:val="52"/>
-        </w:rPr>
-        <w:t>quiz_</w:t>
-      </w:r>
-      <w:proofErr w:type="gramStart"/>
-      <w:r>
-        <w:rPr>
-          <w:sz w:val="52"/>
-          <w:szCs w:val="52"/>
-        </w:rPr>
-        <w:t>finished</w:t>
-      </w:r>
-      <w:proofErr w:type="spellEnd"/>
-      <w:r>
-        <w:rPr>
-          <w:sz w:val="52"/>
-          <w:szCs w:val="52"/>
-        </w:rPr>
-        <w:t>(</w:t>
-      </w:r>
-      <w:proofErr w:type="gramEnd"/>
-      <w:r>
-        <w:rPr>
-          <w:sz w:val="52"/>
-          <w:szCs w:val="52"/>
-        </w:rPr>
-        <w:t>)</w:t>
+      <w:r>
+        <w:rPr>
+          <w:sz w:val="52"/>
+          <w:szCs w:val="52"/>
+        </w:rPr>
+        <w:t xml:space="preserve">Create script that emits a signal when a CharacterBody2D enters </w:t>
+      </w:r>
+      <w:proofErr w:type="spellStart"/>
+      <w:r>
+        <w:rPr>
+          <w:sz w:val="52"/>
+          <w:szCs w:val="52"/>
+        </w:rPr>
+        <w:t>door_to_home</w:t>
+      </w:r>
+      <w:proofErr w:type="spellEnd"/>
+      <w:r>
+        <w:rPr>
+          <w:sz w:val="52"/>
+          <w:szCs w:val="52"/>
+        </w:rPr>
+        <w:t>.</w:t>
+      </w:r>
+    </w:p>
+    <w:p>
+      <w:pPr>
+        <w:rPr>
+          <w:sz w:val="52"/>
+          <w:szCs w:val="52"/>
+        </w:rPr>
+      </w:pPr>
+    </w:p>
+    <w:p>
+      <w:pPr>
+        <w:pStyle w:val="ListParagraph"/>
+        <w:numPr>
+          <w:ilvl w:val="0"/>
+          <w:numId w:val="2"/>
+        </w:numPr>
+        <w:rPr>
+          <w:sz w:val="52"/>
+          <w:szCs w:val="52"/>
+        </w:rPr>
+      </w:pPr>
+      <w:r>
+        <w:rPr>
+          <w:sz w:val="52"/>
+          <w:szCs w:val="52"/>
+        </w:rPr>
+        <w:t>Home scene</w:t>
+      </w:r>
+    </w:p>
+    <w:p>
+      <w:pPr>
+        <w:pStyle w:val="ListParagraph"/>
+        <w:numPr>
+          <w:ilvl w:val="1"/>
+          <w:numId w:val="2"/>
+        </w:numPr>
+        <w:rPr>
+          <w:sz w:val="52"/>
+          <w:szCs w:val="52"/>
+        </w:rPr>
+      </w:pPr>
+      <w:r>
+        <w:rPr>
+          <w:sz w:val="52"/>
+          <w:szCs w:val="52"/>
+        </w:rPr>
+        <w:t>Need to instantiate Newspaper and Bed</w:t>
+      </w:r>
+    </w:p>
+    <w:p>
+      <w:pPr>
+        <w:pStyle w:val="ListParagraph"/>
+        <w:numPr>
+          <w:ilvl w:val="1"/>
+          <w:numId w:val="2"/>
+        </w:numPr>
+        <w:rPr>
+          <w:sz w:val="52"/>
+          <w:szCs w:val="52"/>
+        </w:rPr>
+      </w:pPr>
+      <w:r>
+        <w:rPr>
+          <w:sz w:val="52"/>
+          <w:szCs w:val="52"/>
+        </w:rPr>
+        <w:t>Need to get scene background</w:t>
+      </w:r>
+    </w:p>
+    <w:p>
+      <w:pPr>
+        <w:pStyle w:val="ListParagraph"/>
+        <w:numPr>
+          <w:ilvl w:val="1"/>
+          <w:numId w:val="2"/>
+        </w:numPr>
+        <w:rPr>
+          <w:sz w:val="52"/>
+          <w:szCs w:val="52"/>
+        </w:rPr>
+      </w:pPr>
+      <w:r>
+        <w:rPr>
+          <w:sz w:val="52"/>
+          <w:szCs w:val="52"/>
+        </w:rPr>
+        <w:lastRenderedPageBreak/>
+        <w:t xml:space="preserve">Need to add area2D node to scene w/ corresponding CollisionShape2d called </w:t>
+      </w:r>
+      <w:proofErr w:type="spellStart"/>
+      <w:r>
+        <w:rPr>
+          <w:sz w:val="52"/>
+          <w:szCs w:val="52"/>
+        </w:rPr>
+        <w:t>door_to_farm</w:t>
+      </w:r>
+      <w:proofErr w:type="spellEnd"/>
+      <w:r>
+        <w:rPr>
+          <w:sz w:val="52"/>
+          <w:szCs w:val="52"/>
+        </w:rPr>
+        <w:t>,</w:t>
+      </w:r>
+    </w:p>
+    <w:p>
+      <w:pPr>
+        <w:pStyle w:val="ListParagraph"/>
+        <w:numPr>
+          <w:ilvl w:val="1"/>
+          <w:numId w:val="2"/>
+        </w:numPr>
+        <w:rPr>
+          <w:sz w:val="52"/>
+          <w:szCs w:val="52"/>
+        </w:rPr>
+      </w:pPr>
+      <w:r>
+        <w:rPr>
+          <w:sz w:val="52"/>
+          <w:szCs w:val="52"/>
+        </w:rPr>
+        <w:t>Need to add StaticBody2D nodes w/ corresponding CollisionShape2D.</w:t>
       </w:r>
     </w:p>
     <w:p>
@@ -1932,66 +2827,95 @@
           <w:sz w:val="52"/>
           <w:szCs w:val="52"/>
         </w:rPr>
-        <w:t xml:space="preserve">Should emit a signal </w:t>
-      </w:r>
-      <w:r>
-        <w:rPr>
-          <w:sz w:val="52"/>
-          <w:szCs w:val="52"/>
-        </w:rPr>
-        <w:t>with</w:t>
-      </w:r>
-      <w:r>
-        <w:rPr>
-          <w:sz w:val="52"/>
-          <w:szCs w:val="52"/>
-        </w:rPr>
-        <w:t xml:space="preserve"> </w:t>
-      </w:r>
-      <w:proofErr w:type="spellStart"/>
-      <w:r>
-        <w:rPr>
-          <w:sz w:val="52"/>
-          <w:szCs w:val="52"/>
-        </w:rPr>
-        <w:t>answered_correclty</w:t>
-      </w:r>
-      <w:proofErr w:type="spellEnd"/>
-      <w:r>
-        <w:rPr>
-          <w:sz w:val="52"/>
-          <w:szCs w:val="52"/>
-        </w:rPr>
-        <w:t xml:space="preserve"> through signal </w:t>
-      </w:r>
-      <w:proofErr w:type="gramStart"/>
-      <w:r>
-        <w:rPr>
-          <w:sz w:val="52"/>
-          <w:szCs w:val="52"/>
-        </w:rPr>
-        <w:t>hub .</w:t>
-      </w:r>
-      <w:proofErr w:type="gramEnd"/>
-    </w:p>
-    <w:p>
-      <w:pPr>
-        <w:pStyle w:val="ListParagraph"/>
-        <w:numPr>
-          <w:ilvl w:val="3"/>
-          <w:numId w:val="2"/>
-        </w:numPr>
-        <w:rPr>
-          <w:sz w:val="52"/>
-          <w:szCs w:val="52"/>
-        </w:rPr>
-      </w:pPr>
-      <w:r>
-        <w:rPr>
-          <w:sz w:val="52"/>
-          <w:szCs w:val="52"/>
-        </w:rPr>
-        <w:t>Need to create signal in signal hub first that holds an int.</w:t>
+        <w:t>Stop player from walking through home walls</w:t>
+      </w:r>
+    </w:p>
+    <w:p>
+      <w:pPr>
+        <w:pStyle w:val="ListParagraph"/>
+        <w:numPr>
+          <w:ilvl w:val="1"/>
+          <w:numId w:val="2"/>
+        </w:numPr>
+        <w:rPr>
+          <w:sz w:val="52"/>
+          <w:szCs w:val="52"/>
+        </w:rPr>
+      </w:pPr>
+      <w:r>
+        <w:rPr>
+          <w:sz w:val="52"/>
+          <w:szCs w:val="52"/>
+        </w:rPr>
+        <w:t xml:space="preserve">Create attached script that emits a signal when a CharacterBody2D enters </w:t>
+      </w:r>
+      <w:proofErr w:type="spellStart"/>
+      <w:r>
+        <w:rPr>
+          <w:sz w:val="52"/>
+          <w:szCs w:val="52"/>
+        </w:rPr>
+        <w:t>door_to_farm</w:t>
+      </w:r>
+      <w:proofErr w:type="spellEnd"/>
+      <w:r>
+        <w:rPr>
+          <w:sz w:val="52"/>
+          <w:szCs w:val="52"/>
+        </w:rPr>
+        <w:t>.</w:t>
+      </w:r>
+    </w:p>
+    <w:p>
+      <w:pPr>
+        <w:rPr>
+          <w:sz w:val="52"/>
+          <w:szCs w:val="52"/>
+        </w:rPr>
+      </w:pPr>
+    </w:p>
+    <w:p>
+      <w:pPr>
+        <w:pStyle w:val="ListParagraph"/>
+        <w:numPr>
+          <w:ilvl w:val="0"/>
+          <w:numId w:val="2"/>
+        </w:numPr>
+        <w:rPr>
+          <w:color w:val="E97132" w:themeColor="accent2"/>
+          <w:sz w:val="52"/>
+          <w:szCs w:val="52"/>
+        </w:rPr>
+      </w:pPr>
+      <w:r>
+        <w:rPr>
+          <w:color w:val="E97132" w:themeColor="accent2"/>
+          <w:sz w:val="52"/>
+          <w:szCs w:val="52"/>
+        </w:rPr>
+        <w:t>Create a Main Menu scene</w:t>
+      </w:r>
+    </w:p>
+    <w:p>
+      <w:pPr>
+        <w:pStyle w:val="ListParagraph"/>
+        <w:numPr>
+          <w:ilvl w:val="1"/>
+          <w:numId w:val="2"/>
+        </w:numPr>
+        <w:rPr>
+          <w:color w:val="E97132" w:themeColor="accent2"/>
+          <w:sz w:val="52"/>
+          <w:szCs w:val="52"/>
+        </w:rPr>
+      </w:pPr>
+      <w:r>
+        <w:rPr>
+          <w:color w:val="E97132" w:themeColor="accent2"/>
+          <w:sz w:val="52"/>
+          <w:szCs w:val="52"/>
+        </w:rPr>
+        <w:t>should contain the follow buttons</w:t>
       </w:r>
     </w:p>
     <w:p>
@@ -2002,36 +2926,63 @@
           <w:numId w:val="2"/>
         </w:numPr>
         <w:rPr>
-          <w:sz w:val="52"/>
-          <w:szCs w:val="52"/>
-        </w:rPr>
-      </w:pPr>
-      <w:r>
-        <w:rPr>
-          <w:sz w:val="52"/>
-          <w:szCs w:val="52"/>
-        </w:rPr>
-        <w:t>Should hide all containers</w:t>
-      </w:r>
-    </w:p>
-    <w:p>
-      <w:pPr>
-        <w:pStyle w:val="ListParagraph"/>
-        <w:numPr>
-          <w:ilvl w:val="0"/>
-          <w:numId w:val="2"/>
-        </w:numPr>
-        <w:rPr>
-          <w:sz w:val="52"/>
-          <w:szCs w:val="52"/>
-        </w:rPr>
-      </w:pPr>
-      <w:r>
-        <w:rPr>
-          <w:sz w:val="52"/>
-          <w:szCs w:val="52"/>
-        </w:rPr>
-        <w:t>Farm Scene</w:t>
+          <w:color w:val="E97132" w:themeColor="accent2"/>
+          <w:sz w:val="52"/>
+          <w:szCs w:val="52"/>
+        </w:rPr>
+      </w:pPr>
+      <w:r>
+        <w:rPr>
+          <w:color w:val="E97132" w:themeColor="accent2"/>
+          <w:sz w:val="52"/>
+          <w:szCs w:val="52"/>
+        </w:rPr>
+        <w:t>Start New Game</w:t>
+      </w:r>
+    </w:p>
+    <w:p>
+      <w:pPr>
+        <w:pStyle w:val="ListParagraph"/>
+        <w:numPr>
+          <w:ilvl w:val="2"/>
+          <w:numId w:val="2"/>
+        </w:numPr>
+        <w:rPr>
+          <w:color w:val="E97132" w:themeColor="accent2"/>
+          <w:sz w:val="52"/>
+          <w:szCs w:val="52"/>
+        </w:rPr>
+      </w:pPr>
+      <w:r>
+        <w:rPr>
+          <w:color w:val="E97132" w:themeColor="accent2"/>
+          <w:sz w:val="52"/>
+          <w:szCs w:val="52"/>
+        </w:rPr>
+        <w:t>Load Save</w:t>
+      </w:r>
+    </w:p>
+    <w:p>
+      <w:pPr>
+        <w:pStyle w:val="ListParagraph"/>
+        <w:numPr>
+          <w:ilvl w:val="2"/>
+          <w:numId w:val="2"/>
+        </w:numPr>
+        <w:rPr>
+          <w:color w:val="E97132" w:themeColor="accent2"/>
+          <w:sz w:val="52"/>
+          <w:szCs w:val="52"/>
+        </w:rPr>
+      </w:pPr>
+      <w:r>
+        <w:rPr>
+          <w:color w:val="E97132" w:themeColor="accent2"/>
+          <w:sz w:val="52"/>
+          <w:szCs w:val="52"/>
+        </w:rPr>
+        <w:lastRenderedPageBreak/>
+        <w:t>Quit</w:t>
       </w:r>
     </w:p>
     <w:p>
@@ -2042,32 +2993,96 @@
           <w:numId w:val="2"/>
         </w:numPr>
         <w:rPr>
-          <w:sz w:val="52"/>
-          <w:szCs w:val="52"/>
-        </w:rPr>
-      </w:pPr>
-      <w:r>
-        <w:rPr>
-          <w:sz w:val="52"/>
-          <w:szCs w:val="52"/>
-        </w:rPr>
-        <w:t>Need to instantiate 3 Tree’s, assign difficulty levels, 3 levels of growth, and name (TREE</w:t>
-      </w:r>
-      <w:proofErr w:type="gramStart"/>
-      <w:r>
-        <w:rPr>
-          <w:sz w:val="52"/>
-          <w:szCs w:val="52"/>
-        </w:rPr>
-        <w:t>1,TREE2,TREE</w:t>
-      </w:r>
-      <w:proofErr w:type="gramEnd"/>
-      <w:r>
-        <w:rPr>
-          <w:sz w:val="52"/>
-          <w:szCs w:val="52"/>
-        </w:rPr>
-        <w:t>3)</w:t>
+          <w:color w:val="E97132" w:themeColor="accent2"/>
+          <w:sz w:val="52"/>
+          <w:szCs w:val="52"/>
+        </w:rPr>
+      </w:pPr>
+      <w:r>
+        <w:rPr>
+          <w:color w:val="E97132" w:themeColor="accent2"/>
+          <w:sz w:val="52"/>
+          <w:szCs w:val="52"/>
+        </w:rPr>
+        <w:t xml:space="preserve">For </w:t>
+      </w:r>
+      <w:r>
+        <w:rPr>
+          <w:color w:val="E97132" w:themeColor="accent2"/>
+          <w:sz w:val="52"/>
+          <w:szCs w:val="52"/>
+        </w:rPr>
+        <w:t>load save and start new game</w:t>
+      </w:r>
+      <w:r>
+        <w:rPr>
+          <w:color w:val="E97132" w:themeColor="accent2"/>
+          <w:sz w:val="52"/>
+          <w:szCs w:val="52"/>
+        </w:rPr>
+        <w:t>:</w:t>
+      </w:r>
+    </w:p>
+    <w:p>
+      <w:pPr>
+        <w:pStyle w:val="ListParagraph"/>
+        <w:numPr>
+          <w:ilvl w:val="2"/>
+          <w:numId w:val="2"/>
+        </w:numPr>
+        <w:rPr>
+          <w:color w:val="E97132" w:themeColor="accent2"/>
+          <w:sz w:val="52"/>
+          <w:szCs w:val="52"/>
+        </w:rPr>
+      </w:pPr>
+      <w:r>
+        <w:rPr>
+          <w:color w:val="E97132" w:themeColor="accent2"/>
+          <w:sz w:val="52"/>
+          <w:szCs w:val="52"/>
+        </w:rPr>
+        <w:t>Create signal in signal hub</w:t>
+      </w:r>
+    </w:p>
+    <w:p>
+      <w:pPr>
+        <w:pStyle w:val="ListParagraph"/>
+        <w:numPr>
+          <w:ilvl w:val="2"/>
+          <w:numId w:val="2"/>
+        </w:numPr>
+        <w:rPr>
+          <w:color w:val="E97132" w:themeColor="accent2"/>
+          <w:sz w:val="52"/>
+          <w:szCs w:val="52"/>
+        </w:rPr>
+      </w:pPr>
+      <w:r>
+        <w:rPr>
+          <w:color w:val="E97132" w:themeColor="accent2"/>
+          <w:sz w:val="52"/>
+          <w:szCs w:val="52"/>
+        </w:rPr>
+        <w:t xml:space="preserve">Create function in </w:t>
+      </w:r>
+      <w:proofErr w:type="spellStart"/>
+      <w:r>
+        <w:rPr>
+          <w:color w:val="E97132" w:themeColor="accent2"/>
+          <w:sz w:val="52"/>
+          <w:szCs w:val="52"/>
+        </w:rPr>
+        <w:t>scene_transitioner</w:t>
+      </w:r>
+      <w:proofErr w:type="spellEnd"/>
+      <w:r>
+        <w:rPr>
+          <w:color w:val="E97132" w:themeColor="accent2"/>
+          <w:sz w:val="52"/>
+          <w:szCs w:val="52"/>
+        </w:rPr>
+        <w:t xml:space="preserve"> and connect it to the signal to transition to the proper scene</w:t>
       </w:r>
     </w:p>
     <w:p>
@@ -2078,37 +3093,18 @@
           <w:numId w:val="2"/>
         </w:numPr>
         <w:rPr>
-          <w:sz w:val="52"/>
-          <w:szCs w:val="52"/>
-        </w:rPr>
-      </w:pPr>
-      <w:r>
-        <w:rPr>
-          <w:sz w:val="52"/>
-          <w:szCs w:val="52"/>
-        </w:rPr>
-        <w:lastRenderedPageBreak/>
-        <w:t>Need to get scene background</w:t>
-      </w:r>
-    </w:p>
-    <w:p>
-      <w:pPr>
-        <w:pStyle w:val="ListParagraph"/>
-        <w:numPr>
-          <w:ilvl w:val="2"/>
-          <w:numId w:val="2"/>
-        </w:numPr>
-        <w:rPr>
-          <w:sz w:val="52"/>
-          <w:szCs w:val="52"/>
-        </w:rPr>
-      </w:pPr>
-      <w:r>
-        <w:rPr>
-          <w:sz w:val="52"/>
-          <w:szCs w:val="52"/>
-        </w:rPr>
-        <w:t>Should have a farm area and a home area</w:t>
+          <w:color w:val="E97132" w:themeColor="accent2"/>
+          <w:sz w:val="52"/>
+          <w:szCs w:val="52"/>
+        </w:rPr>
+      </w:pPr>
+      <w:r>
+        <w:rPr>
+          <w:color w:val="E97132" w:themeColor="accent2"/>
+          <w:sz w:val="52"/>
+          <w:szCs w:val="52"/>
+        </w:rPr>
+        <w:t>Quit button should exit the game</w:t>
       </w:r>
     </w:p>
     <w:p>
@@ -2119,384 +3115,6 @@
           <w:numId w:val="2"/>
         </w:numPr>
         <w:rPr>
-          <w:sz w:val="52"/>
-          <w:szCs w:val="52"/>
-        </w:rPr>
-      </w:pPr>
-      <w:r>
-        <w:rPr>
-          <w:sz w:val="52"/>
-          <w:szCs w:val="52"/>
-        </w:rPr>
-        <w:t xml:space="preserve">Need to add area2D node to scene w/ corresponding </w:t>
-      </w:r>
-      <w:r>
-        <w:rPr>
-          <w:sz w:val="52"/>
-          <w:szCs w:val="52"/>
-        </w:rPr>
-        <w:t xml:space="preserve">CollisionShape2d </w:t>
-      </w:r>
-      <w:r>
-        <w:rPr>
-          <w:sz w:val="52"/>
-          <w:szCs w:val="52"/>
-        </w:rPr>
-        <w:t xml:space="preserve">called </w:t>
-      </w:r>
-      <w:proofErr w:type="spellStart"/>
-      <w:r>
-        <w:rPr>
-          <w:sz w:val="52"/>
-          <w:szCs w:val="52"/>
-        </w:rPr>
-        <w:t>door_to_home</w:t>
-      </w:r>
-      <w:proofErr w:type="spellEnd"/>
-      <w:r>
-        <w:rPr>
-          <w:sz w:val="52"/>
-          <w:szCs w:val="52"/>
-        </w:rPr>
-        <w:t>.</w:t>
-      </w:r>
-    </w:p>
-    <w:p>
-      <w:pPr>
-        <w:pStyle w:val="ListParagraph"/>
-        <w:numPr>
-          <w:ilvl w:val="1"/>
-          <w:numId w:val="2"/>
-        </w:numPr>
-        <w:rPr>
-          <w:sz w:val="52"/>
-          <w:szCs w:val="52"/>
-        </w:rPr>
-      </w:pPr>
-      <w:r>
-        <w:rPr>
-          <w:sz w:val="52"/>
-          <w:szCs w:val="52"/>
-        </w:rPr>
-        <w:t>Need to add StaticBody2D nodes w/ corresponding CollisionShape2D.</w:t>
-      </w:r>
-    </w:p>
-    <w:p>
-      <w:pPr>
-        <w:pStyle w:val="ListParagraph"/>
-        <w:numPr>
-          <w:ilvl w:val="2"/>
-          <w:numId w:val="2"/>
-        </w:numPr>
-        <w:rPr>
-          <w:sz w:val="52"/>
-          <w:szCs w:val="52"/>
-        </w:rPr>
-      </w:pPr>
-      <w:r>
-        <w:rPr>
-          <w:sz w:val="52"/>
-          <w:szCs w:val="52"/>
-        </w:rPr>
-        <w:t>Stop player from walking on top of home.</w:t>
-      </w:r>
-    </w:p>
-    <w:p>
-      <w:pPr>
-        <w:pStyle w:val="ListParagraph"/>
-        <w:numPr>
-          <w:ilvl w:val="2"/>
-          <w:numId w:val="2"/>
-        </w:numPr>
-        <w:rPr>
-          <w:sz w:val="52"/>
-          <w:szCs w:val="52"/>
-        </w:rPr>
-      </w:pPr>
-      <w:r>
-        <w:rPr>
-          <w:sz w:val="52"/>
-          <w:szCs w:val="52"/>
-        </w:rPr>
-        <w:t>Set world boundaries to stop player from walking out of the map.</w:t>
-      </w:r>
-    </w:p>
-    <w:p>
-      <w:pPr>
-        <w:pStyle w:val="ListParagraph"/>
-        <w:numPr>
-          <w:ilvl w:val="1"/>
-          <w:numId w:val="2"/>
-        </w:numPr>
-        <w:rPr>
-          <w:sz w:val="52"/>
-          <w:szCs w:val="52"/>
-        </w:rPr>
-      </w:pPr>
-      <w:r>
-        <w:rPr>
-          <w:sz w:val="52"/>
-          <w:szCs w:val="52"/>
-        </w:rPr>
-        <w:lastRenderedPageBreak/>
-        <w:t xml:space="preserve">Create script that emits a signal when a CharacterBody2D enters </w:t>
-      </w:r>
-      <w:proofErr w:type="spellStart"/>
-      <w:r>
-        <w:rPr>
-          <w:sz w:val="52"/>
-          <w:szCs w:val="52"/>
-        </w:rPr>
-        <w:t>door_to_home</w:t>
-      </w:r>
-      <w:proofErr w:type="spellEnd"/>
-      <w:r>
-        <w:rPr>
-          <w:sz w:val="52"/>
-          <w:szCs w:val="52"/>
-        </w:rPr>
-        <w:t>.</w:t>
-      </w:r>
-    </w:p>
-    <w:p>
-      <w:pPr>
-        <w:rPr>
-          <w:sz w:val="52"/>
-          <w:szCs w:val="52"/>
-        </w:rPr>
-      </w:pPr>
-    </w:p>
-    <w:p>
-      <w:pPr>
-        <w:pStyle w:val="ListParagraph"/>
-        <w:numPr>
-          <w:ilvl w:val="0"/>
-          <w:numId w:val="2"/>
-        </w:numPr>
-        <w:rPr>
-          <w:sz w:val="52"/>
-          <w:szCs w:val="52"/>
-        </w:rPr>
-      </w:pPr>
-      <w:r>
-        <w:rPr>
-          <w:sz w:val="52"/>
-          <w:szCs w:val="52"/>
-        </w:rPr>
-        <w:t>Home scene</w:t>
-      </w:r>
-    </w:p>
-    <w:p>
-      <w:pPr>
-        <w:pStyle w:val="ListParagraph"/>
-        <w:numPr>
-          <w:ilvl w:val="1"/>
-          <w:numId w:val="2"/>
-        </w:numPr>
-        <w:rPr>
-          <w:sz w:val="52"/>
-          <w:szCs w:val="52"/>
-        </w:rPr>
-      </w:pPr>
-      <w:r>
-        <w:rPr>
-          <w:sz w:val="52"/>
-          <w:szCs w:val="52"/>
-        </w:rPr>
-        <w:t xml:space="preserve">Need to instantiate </w:t>
-      </w:r>
-      <w:r>
-        <w:rPr>
-          <w:sz w:val="52"/>
-          <w:szCs w:val="52"/>
-        </w:rPr>
-        <w:t>Newspaper and Bed</w:t>
-      </w:r>
-    </w:p>
-    <w:p>
-      <w:pPr>
-        <w:pStyle w:val="ListParagraph"/>
-        <w:numPr>
-          <w:ilvl w:val="1"/>
-          <w:numId w:val="2"/>
-        </w:numPr>
-        <w:rPr>
-          <w:sz w:val="52"/>
-          <w:szCs w:val="52"/>
-        </w:rPr>
-      </w:pPr>
-      <w:r>
-        <w:rPr>
-          <w:sz w:val="52"/>
-          <w:szCs w:val="52"/>
-        </w:rPr>
-        <w:t>Need to get scene background</w:t>
-      </w:r>
-    </w:p>
-    <w:p>
-      <w:pPr>
-        <w:pStyle w:val="ListParagraph"/>
-        <w:numPr>
-          <w:ilvl w:val="1"/>
-          <w:numId w:val="2"/>
-        </w:numPr>
-        <w:rPr>
-          <w:sz w:val="52"/>
-          <w:szCs w:val="52"/>
-        </w:rPr>
-      </w:pPr>
-      <w:r>
-        <w:rPr>
-          <w:sz w:val="52"/>
-          <w:szCs w:val="52"/>
-        </w:rPr>
-        <w:t xml:space="preserve">Need to add area2D node to scene w/ corresponding CollisionShape2d called </w:t>
-      </w:r>
-      <w:proofErr w:type="spellStart"/>
-      <w:r>
-        <w:rPr>
-          <w:sz w:val="52"/>
-          <w:szCs w:val="52"/>
-        </w:rPr>
-        <w:t>door_to</w:t>
-      </w:r>
-      <w:r>
-        <w:rPr>
-          <w:sz w:val="52"/>
-          <w:szCs w:val="52"/>
-        </w:rPr>
-        <w:t>_farm</w:t>
-      </w:r>
-      <w:proofErr w:type="spellEnd"/>
-      <w:r>
-        <w:rPr>
-          <w:sz w:val="52"/>
-          <w:szCs w:val="52"/>
-        </w:rPr>
-        <w:t>,</w:t>
-      </w:r>
-    </w:p>
-    <w:p>
-      <w:pPr>
-        <w:pStyle w:val="ListParagraph"/>
-        <w:numPr>
-          <w:ilvl w:val="1"/>
-          <w:numId w:val="2"/>
-        </w:numPr>
-        <w:rPr>
-          <w:sz w:val="52"/>
-          <w:szCs w:val="52"/>
-        </w:rPr>
-      </w:pPr>
-      <w:r>
-        <w:rPr>
-          <w:sz w:val="52"/>
-          <w:szCs w:val="52"/>
-        </w:rPr>
-        <w:t>Need to add StaticBody2D nodes w/ corresponding CollisionShape2D.</w:t>
-      </w:r>
-    </w:p>
-    <w:p>
-      <w:pPr>
-        <w:pStyle w:val="ListParagraph"/>
-        <w:numPr>
-          <w:ilvl w:val="2"/>
-          <w:numId w:val="2"/>
-        </w:numPr>
-        <w:rPr>
-          <w:sz w:val="52"/>
-          <w:szCs w:val="52"/>
-        </w:rPr>
-      </w:pPr>
-      <w:r>
-        <w:rPr>
-          <w:sz w:val="52"/>
-          <w:szCs w:val="52"/>
-        </w:rPr>
-        <w:t xml:space="preserve">Stop player from walking </w:t>
-      </w:r>
-      <w:r>
-        <w:rPr>
-          <w:sz w:val="52"/>
-          <w:szCs w:val="52"/>
-        </w:rPr>
-        <w:t>through home walls</w:t>
-      </w:r>
-    </w:p>
-    <w:p>
-      <w:pPr>
-        <w:pStyle w:val="ListParagraph"/>
-        <w:numPr>
-          <w:ilvl w:val="1"/>
-          <w:numId w:val="2"/>
-        </w:numPr>
-        <w:rPr>
-          <w:sz w:val="52"/>
-          <w:szCs w:val="52"/>
-        </w:rPr>
-      </w:pPr>
-      <w:r>
-        <w:rPr>
-          <w:sz w:val="52"/>
-          <w:szCs w:val="52"/>
-        </w:rPr>
-        <w:lastRenderedPageBreak/>
-        <w:t xml:space="preserve">Create </w:t>
-      </w:r>
-      <w:r>
-        <w:rPr>
-          <w:sz w:val="52"/>
-          <w:szCs w:val="52"/>
-        </w:rPr>
-        <w:t xml:space="preserve">attached script </w:t>
-      </w:r>
-      <w:r>
-        <w:rPr>
-          <w:sz w:val="52"/>
-          <w:szCs w:val="52"/>
-        </w:rPr>
-        <w:t xml:space="preserve">that emits a signal when a CharacterBody2D enters </w:t>
-      </w:r>
-      <w:proofErr w:type="spellStart"/>
-      <w:r>
-        <w:rPr>
-          <w:sz w:val="52"/>
-          <w:szCs w:val="52"/>
-        </w:rPr>
-        <w:t>door_to_</w:t>
-      </w:r>
-      <w:r>
-        <w:rPr>
-          <w:sz w:val="52"/>
-          <w:szCs w:val="52"/>
-        </w:rPr>
-        <w:t>farm</w:t>
-      </w:r>
-      <w:proofErr w:type="spellEnd"/>
-      <w:r>
-        <w:rPr>
-          <w:sz w:val="52"/>
-          <w:szCs w:val="52"/>
-        </w:rPr>
-        <w:t>.</w:t>
-      </w:r>
-    </w:p>
-    <w:p>
-      <w:pPr>
-        <w:rPr>
-          <w:sz w:val="52"/>
-          <w:szCs w:val="52"/>
-        </w:rPr>
-      </w:pPr>
-    </w:p>
-    <w:p>
-      <w:pPr>
-        <w:pStyle w:val="ListParagraph"/>
-        <w:numPr>
-          <w:ilvl w:val="0"/>
-          <w:numId w:val="2"/>
-        </w:numPr>
-        <w:rPr>
           <w:color w:val="E97132" w:themeColor="accent2"/>
           <w:sz w:val="52"/>
           <w:szCs w:val="52"/>
@@ -2508,239 +3126,6 @@
           <w:sz w:val="52"/>
           <w:szCs w:val="52"/>
         </w:rPr>
-        <w:t>Create a Main Menu scene</w:t>
-      </w:r>
-    </w:p>
-    <w:p>
-      <w:pPr>
-        <w:pStyle w:val="ListParagraph"/>
-        <w:numPr>
-          <w:ilvl w:val="1"/>
-          <w:numId w:val="2"/>
-        </w:numPr>
-        <w:rPr>
-          <w:color w:val="E97132" w:themeColor="accent2"/>
-          <w:sz w:val="52"/>
-          <w:szCs w:val="52"/>
-        </w:rPr>
-      </w:pPr>
-      <w:r>
-        <w:rPr>
-          <w:color w:val="E97132" w:themeColor="accent2"/>
-          <w:sz w:val="52"/>
-          <w:szCs w:val="52"/>
-        </w:rPr>
-        <w:t>should contain the follow buttons</w:t>
-      </w:r>
-    </w:p>
-    <w:p>
-      <w:pPr>
-        <w:pStyle w:val="ListParagraph"/>
-        <w:numPr>
-          <w:ilvl w:val="2"/>
-          <w:numId w:val="2"/>
-        </w:numPr>
-        <w:rPr>
-          <w:color w:val="E97132" w:themeColor="accent2"/>
-          <w:sz w:val="52"/>
-          <w:szCs w:val="52"/>
-        </w:rPr>
-      </w:pPr>
-      <w:r>
-        <w:rPr>
-          <w:color w:val="E97132" w:themeColor="accent2"/>
-          <w:sz w:val="52"/>
-          <w:szCs w:val="52"/>
-        </w:rPr>
-        <w:t>Start New Game</w:t>
-      </w:r>
-    </w:p>
-    <w:p>
-      <w:pPr>
-        <w:pStyle w:val="ListParagraph"/>
-        <w:numPr>
-          <w:ilvl w:val="2"/>
-          <w:numId w:val="2"/>
-        </w:numPr>
-        <w:rPr>
-          <w:color w:val="E97132" w:themeColor="accent2"/>
-          <w:sz w:val="52"/>
-          <w:szCs w:val="52"/>
-        </w:rPr>
-      </w:pPr>
-      <w:r>
-        <w:rPr>
-          <w:color w:val="E97132" w:themeColor="accent2"/>
-          <w:sz w:val="52"/>
-          <w:szCs w:val="52"/>
-        </w:rPr>
-        <w:t>Load Save</w:t>
-      </w:r>
-    </w:p>
-    <w:p>
-      <w:pPr>
-        <w:pStyle w:val="ListParagraph"/>
-        <w:numPr>
-          <w:ilvl w:val="2"/>
-          <w:numId w:val="2"/>
-        </w:numPr>
-        <w:rPr>
-          <w:color w:val="E97132" w:themeColor="accent2"/>
-          <w:sz w:val="52"/>
-          <w:szCs w:val="52"/>
-        </w:rPr>
-      </w:pPr>
-      <w:r>
-        <w:rPr>
-          <w:color w:val="E97132" w:themeColor="accent2"/>
-          <w:sz w:val="52"/>
-          <w:szCs w:val="52"/>
-        </w:rPr>
-        <w:t>Quit</w:t>
-      </w:r>
-    </w:p>
-    <w:p>
-      <w:pPr>
-        <w:pStyle w:val="ListParagraph"/>
-        <w:numPr>
-          <w:ilvl w:val="1"/>
-          <w:numId w:val="2"/>
-        </w:numPr>
-        <w:rPr>
-          <w:color w:val="E97132" w:themeColor="accent2"/>
-          <w:sz w:val="52"/>
-          <w:szCs w:val="52"/>
-        </w:rPr>
-      </w:pPr>
-      <w:r>
-        <w:rPr>
-          <w:color w:val="E97132" w:themeColor="accent2"/>
-          <w:sz w:val="52"/>
-          <w:szCs w:val="52"/>
-        </w:rPr>
-        <w:t xml:space="preserve">For </w:t>
-      </w:r>
-      <w:r>
-        <w:rPr>
-          <w:color w:val="E97132" w:themeColor="accent2"/>
-          <w:sz w:val="52"/>
-          <w:szCs w:val="52"/>
-        </w:rPr>
-        <w:t>load save and start new game</w:t>
-      </w:r>
-      <w:r>
-        <w:rPr>
-          <w:color w:val="E97132" w:themeColor="accent2"/>
-          <w:sz w:val="52"/>
-          <w:szCs w:val="52"/>
-        </w:rPr>
-        <w:t>:</w:t>
-      </w:r>
-    </w:p>
-    <w:p>
-      <w:pPr>
-        <w:pStyle w:val="ListParagraph"/>
-        <w:numPr>
-          <w:ilvl w:val="2"/>
-          <w:numId w:val="2"/>
-        </w:numPr>
-        <w:rPr>
-          <w:color w:val="E97132" w:themeColor="accent2"/>
-          <w:sz w:val="52"/>
-          <w:szCs w:val="52"/>
-        </w:rPr>
-      </w:pPr>
-      <w:r>
-        <w:rPr>
-          <w:color w:val="E97132" w:themeColor="accent2"/>
-          <w:sz w:val="52"/>
-          <w:szCs w:val="52"/>
-        </w:rPr>
-        <w:t>Create signal in signal hub</w:t>
-      </w:r>
-    </w:p>
-    <w:p>
-      <w:pPr>
-        <w:pStyle w:val="ListParagraph"/>
-        <w:numPr>
-          <w:ilvl w:val="2"/>
-          <w:numId w:val="2"/>
-        </w:numPr>
-        <w:rPr>
-          <w:color w:val="E97132" w:themeColor="accent2"/>
-          <w:sz w:val="52"/>
-          <w:szCs w:val="52"/>
-        </w:rPr>
-      </w:pPr>
-      <w:r>
-        <w:rPr>
-          <w:color w:val="E97132" w:themeColor="accent2"/>
-          <w:sz w:val="52"/>
-          <w:szCs w:val="52"/>
-        </w:rPr>
-        <w:t xml:space="preserve">Create function in </w:t>
-      </w:r>
-      <w:proofErr w:type="spellStart"/>
-      <w:r>
-        <w:rPr>
-          <w:color w:val="E97132" w:themeColor="accent2"/>
-          <w:sz w:val="52"/>
-          <w:szCs w:val="52"/>
-        </w:rPr>
-        <w:t>scene_transitioner</w:t>
-      </w:r>
-      <w:proofErr w:type="spellEnd"/>
-      <w:r>
-        <w:rPr>
-          <w:color w:val="E97132" w:themeColor="accent2"/>
-          <w:sz w:val="52"/>
-          <w:szCs w:val="52"/>
-        </w:rPr>
-        <w:t xml:space="preserve"> and connect it to the signal to transition to the proper scene</w:t>
-      </w:r>
-    </w:p>
-    <w:p>
-      <w:pPr>
-        <w:pStyle w:val="ListParagraph"/>
-        <w:numPr>
-          <w:ilvl w:val="1"/>
-          <w:numId w:val="2"/>
-        </w:numPr>
-        <w:rPr>
-          <w:color w:val="E97132" w:themeColor="accent2"/>
-          <w:sz w:val="52"/>
-          <w:szCs w:val="52"/>
-        </w:rPr>
-      </w:pPr>
-      <w:r>
-        <w:rPr>
-          <w:color w:val="E97132" w:themeColor="accent2"/>
-          <w:sz w:val="52"/>
-          <w:szCs w:val="52"/>
-        </w:rPr>
-        <w:t>Quit button should exit the game</w:t>
-      </w:r>
-    </w:p>
-    <w:p>
-      <w:pPr>
-        <w:pStyle w:val="ListParagraph"/>
-        <w:numPr>
-          <w:ilvl w:val="1"/>
-          <w:numId w:val="2"/>
-        </w:numPr>
-        <w:rPr>
-          <w:color w:val="E97132" w:themeColor="accent2"/>
-          <w:sz w:val="52"/>
-          <w:szCs w:val="52"/>
-        </w:rPr>
-      </w:pPr>
-      <w:r>
-        <w:rPr>
-          <w:color w:val="E97132" w:themeColor="accent2"/>
-          <w:sz w:val="52"/>
-          <w:szCs w:val="52"/>
-        </w:rPr>
-        <w:lastRenderedPageBreak/>
         <w:t>Scene should contain a label with the games Title.</w:t>
       </w:r>
     </w:p>

</xml_diff>

<commit_message>
Signal connection / Tree progression
Connected quiz_finished signal to Tree script that increments tree progress.

Created functions that handle:
Scene transitioning when signals are emitted.
Quitting the game when quit_game signal is emitted
</commit_message>
<xml_diff>
--- a/Week 4/Tasks.docx
+++ b/Week 4/Tasks.docx
@@ -278,12 +278,14 @@
         <w:rPr>
           <w:sz w:val="52"/>
           <w:szCs w:val="52"/>
-        </w:rPr>
-      </w:pPr>
-      <w:r>
-        <w:rPr>
-          <w:sz w:val="52"/>
-          <w:szCs w:val="52"/>
+          <w:highlight w:val="green"/>
+        </w:rPr>
+      </w:pPr>
+      <w:r>
+        <w:rPr>
+          <w:sz w:val="52"/>
+          <w:szCs w:val="52"/>
+          <w:highlight w:val="green"/>
         </w:rPr>
         <w:t xml:space="preserve">Create </w:t>
       </w:r>
@@ -292,6 +294,7 @@
         <w:rPr>
           <w:sz w:val="52"/>
           <w:szCs w:val="52"/>
+          <w:highlight w:val="green"/>
         </w:rPr>
         <w:t>func</w:t>
       </w:r>
@@ -300,6 +303,7 @@
         <w:rPr>
           <w:sz w:val="52"/>
           <w:szCs w:val="52"/>
+          <w:highlight w:val="green"/>
         </w:rPr>
         <w:t xml:space="preserve"> that is connected to </w:t>
       </w:r>
@@ -308,6 +312,7 @@
         <w:rPr>
           <w:sz w:val="52"/>
           <w:szCs w:val="52"/>
+          <w:highlight w:val="green"/>
         </w:rPr>
         <w:t>quiz_finished</w:t>
       </w:r>
@@ -316,6 +321,7 @@
         <w:rPr>
           <w:sz w:val="52"/>
           <w:szCs w:val="52"/>
+          <w:highlight w:val="green"/>
         </w:rPr>
         <w:t>.</w:t>
       </w:r>
@@ -350,12 +356,14 @@
         <w:rPr>
           <w:sz w:val="52"/>
           <w:szCs w:val="52"/>
-        </w:rPr>
-      </w:pPr>
-      <w:r>
-        <w:rPr>
-          <w:sz w:val="52"/>
-          <w:szCs w:val="52"/>
+          <w:highlight w:val="green"/>
+        </w:rPr>
+      </w:pPr>
+      <w:r>
+        <w:rPr>
+          <w:sz w:val="52"/>
+          <w:szCs w:val="52"/>
+          <w:highlight w:val="green"/>
         </w:rPr>
         <w:lastRenderedPageBreak/>
         <w:t>Handle signals for transitioning</w:t>

</xml_diff>

<commit_message>
Marking off Task complete
</commit_message>
<xml_diff>
--- a/Week 4/Tasks.docx
+++ b/Week 4/Tasks.docx
@@ -76,61 +76,68 @@
           <w:numId w:val="2"/>
         </w:numPr>
         <w:rPr>
-          <w:color w:val="4EA72E" w:themeColor="accent6"/>
-          <w:sz w:val="52"/>
-          <w:szCs w:val="52"/>
-        </w:rPr>
-      </w:pPr>
-      <w:r>
-        <w:rPr>
-          <w:color w:val="4EA72E" w:themeColor="accent6"/>
-          <w:sz w:val="52"/>
-          <w:szCs w:val="52"/>
+          <w:color w:val="000000" w:themeColor="text1"/>
+          <w:sz w:val="52"/>
+          <w:szCs w:val="52"/>
+          <w:highlight w:val="green"/>
+        </w:rPr>
+      </w:pPr>
+      <w:r>
+        <w:rPr>
+          <w:color w:val="000000" w:themeColor="text1"/>
+          <w:sz w:val="52"/>
+          <w:szCs w:val="52"/>
+          <w:highlight w:val="green"/>
         </w:rPr>
         <w:t xml:space="preserve">Create </w:t>
       </w:r>
       <w:proofErr w:type="spellStart"/>
       <w:r>
         <w:rPr>
-          <w:color w:val="4EA72E" w:themeColor="accent6"/>
-          <w:sz w:val="52"/>
-          <w:szCs w:val="52"/>
+          <w:color w:val="000000" w:themeColor="text1"/>
+          <w:sz w:val="52"/>
+          <w:szCs w:val="52"/>
+          <w:highlight w:val="green"/>
         </w:rPr>
         <w:t>func</w:t>
       </w:r>
       <w:proofErr w:type="spellEnd"/>
       <w:r>
         <w:rPr>
-          <w:color w:val="4EA72E" w:themeColor="accent6"/>
-          <w:sz w:val="52"/>
-          <w:szCs w:val="52"/>
+          <w:color w:val="000000" w:themeColor="text1"/>
+          <w:sz w:val="52"/>
+          <w:szCs w:val="52"/>
+          <w:highlight w:val="green"/>
         </w:rPr>
         <w:t xml:space="preserve"> to pause game when </w:t>
       </w:r>
       <w:proofErr w:type="spellStart"/>
       <w:r>
         <w:rPr>
-          <w:color w:val="4EA72E" w:themeColor="accent6"/>
-          <w:sz w:val="52"/>
-          <w:szCs w:val="52"/>
+          <w:color w:val="000000" w:themeColor="text1"/>
+          <w:sz w:val="52"/>
+          <w:szCs w:val="52"/>
+          <w:highlight w:val="green"/>
         </w:rPr>
         <w:t>pause_game</w:t>
       </w:r>
       <w:proofErr w:type="spellEnd"/>
       <w:r>
         <w:rPr>
-          <w:color w:val="4EA72E" w:themeColor="accent6"/>
-          <w:sz w:val="52"/>
-          <w:szCs w:val="52"/>
+          <w:color w:val="000000" w:themeColor="text1"/>
+          <w:sz w:val="52"/>
+          <w:szCs w:val="52"/>
+          <w:highlight w:val="green"/>
         </w:rPr>
         <w:t xml:space="preserve"> signal and display </w:t>
       </w:r>
       <w:proofErr w:type="spellStart"/>
       <w:r>
         <w:rPr>
-          <w:color w:val="4EA72E" w:themeColor="accent6"/>
-          <w:sz w:val="52"/>
-          <w:szCs w:val="52"/>
+          <w:color w:val="000000" w:themeColor="text1"/>
+          <w:sz w:val="52"/>
+          <w:szCs w:val="52"/>
+          <w:highlight w:val="green"/>
         </w:rPr>
         <w:t>Pause_UI</w:t>
       </w:r>

</xml_diff>